<commit_message>
update SRS for task 1
</commit_message>
<xml_diff>
--- a/Task 1/HV_SRS.docx
+++ b/Task 1/HV_SRS.docx
@@ -792,7 +792,7 @@
             <wp:extent cx="2518590" cy="897531"/>
             <wp:effectExtent b="0" l="0" r="0" t="0"/>
             <wp:wrapNone/>
-            <wp:docPr descr="Logo_FUNIX_update_9102015_convert-01.png" id="7" name="image1.png"/>
+            <wp:docPr descr="Logo_FUNIX_update_9102015_convert-01.png" id="9" name="image1.png"/>
             <a:graphic>
               <a:graphicData uri="http://schemas.openxmlformats.org/drawingml/2006/picture">
                 <pic:pic>
@@ -877,7 +877,7 @@
     </w:p>
     <w:sdt>
       <w:sdtPr>
-        <w:id w:val="209480241"/>
+        <w:id w:val="-1583045220"/>
         <w:docPartObj>
           <w:docPartGallery w:val="Table of Contents"/>
           <w:docPartUnique w:val="1"/>
@@ -3984,14 +3984,14 @@
         <w:rPr/>
         <w:drawing>
           <wp:inline distB="114300" distT="114300" distL="114300" distR="114300">
-            <wp:extent cx="3929063" cy="8386786"/>
+            <wp:extent cx="5731200" cy="7772400"/>
             <wp:effectExtent b="0" l="0" r="0" t="0"/>
-            <wp:docPr id="8" name="image3.png"/>
+            <wp:docPr id="7" name="image2.png"/>
             <a:graphic>
               <a:graphicData uri="http://schemas.openxmlformats.org/drawingml/2006/picture">
                 <pic:pic>
                   <pic:nvPicPr>
-                    <pic:cNvPr id="0" name="image3.png"/>
+                    <pic:cNvPr id="0" name="image2.png"/>
                     <pic:cNvPicPr preferRelativeResize="0"/>
                   </pic:nvPicPr>
                   <pic:blipFill>
@@ -4004,7 +4004,7 @@
                   <pic:spPr>
                     <a:xfrm>
                       <a:off x="0" y="0"/>
-                      <a:ext cx="3929063" cy="8386786"/>
+                      <a:ext cx="5731200" cy="7772400"/>
                     </a:xfrm>
                     <a:prstGeom prst="rect"/>
                     <a:ln/>
@@ -5684,19 +5684,33 @@
       </w:pPr>
       <w:r>
         <w:rPr>
+          <w:rtl w:val="0"/>
+        </w:rPr>
+      </w:r>
+    </w:p>
+    <w:p>
+      <w:pPr>
+        <w:jc w:val="left"/>
+        <w:rPr>
+          <w:b w:val="1"/>
+          <w:bCs w:val="1"/>
+        </w:rPr>
+      </w:pPr>
+      <w:r>
+        <w:rPr>
           <w:b w:val="1"/>
           <w:bCs w:val="1"/>
         </w:rPr>
         <w:drawing>
           <wp:inline distB="114300" distT="114300" distL="114300" distR="114300">
-            <wp:extent cx="5731200" cy="5562600"/>
+            <wp:extent cx="6024563" cy="3917814"/>
             <wp:effectExtent b="0" l="0" r="0" t="0"/>
-            <wp:docPr id="9" name="image2.png"/>
+            <wp:docPr id="8" name="image3.png"/>
             <a:graphic>
               <a:graphicData uri="http://schemas.openxmlformats.org/drawingml/2006/picture">
                 <pic:pic>
                   <pic:nvPicPr>
-                    <pic:cNvPr id="0" name="image2.png"/>
+                    <pic:cNvPr id="0" name="image3.png"/>
                     <pic:cNvPicPr preferRelativeResize="0"/>
                   </pic:nvPicPr>
                   <pic:blipFill>
@@ -5709,7 +5723,7 @@
                   <pic:spPr>
                     <a:xfrm>
                       <a:off x="0" y="0"/>
-                      <a:ext cx="5731200" cy="5562600"/>
+                      <a:ext cx="6024563" cy="3917814"/>
                     </a:xfrm>
                     <a:prstGeom prst="rect"/>
                     <a:ln/>
@@ -5730,14 +5744,23 @@
       <w:pPr>
         <w:ind w:left="720" w:firstLine="0"/>
         <w:jc w:val="left"/>
-        <w:rPr>
-          <w:b w:val="1"/>
-          <w:bCs w:val="1"/>
-        </w:rPr>
+        <w:rPr/>
       </w:pPr>
       <w:r>
         <w:br w:type="page"/>
       </w:r>
+      <w:r>
+        <w:rPr>
+          <w:rtl w:val="0"/>
+        </w:rPr>
+      </w:r>
+    </w:p>
+    <w:p>
+      <w:pPr>
+        <w:ind w:left="720" w:firstLine="0"/>
+        <w:jc w:val="left"/>
+        <w:rPr/>
+      </w:pPr>
       <w:r>
         <w:rPr>
           <w:rtl w:val="0"/>
@@ -5780,56 +5803,49 @@
         <w:tblStyle w:val="Table1"/>
         <w:tblW w:w="8790.0" w:type="dxa"/>
         <w:jc w:val="left"/>
-        <w:tblBorders>
-          <w:top w:color="000000" w:space="0" w:sz="0" w:val="nil"/>
-          <w:left w:color="000000" w:space="0" w:sz="0" w:val="nil"/>
-          <w:bottom w:color="000000" w:space="0" w:sz="0" w:val="nil"/>
-          <w:right w:color="000000" w:space="0" w:sz="0" w:val="nil"/>
-          <w:insideH w:color="000000" w:space="0" w:sz="0" w:val="nil"/>
-          <w:insideV w:color="000000" w:space="0" w:sz="0" w:val="nil"/>
-        </w:tblBorders>
         <w:tblLayout w:type="fixed"/>
         <w:tblLook w:val="0600"/>
       </w:tblPr>
       <w:tblGrid>
-        <w:gridCol w:w="870"/>
-        <w:gridCol w:w="2265"/>
-        <w:gridCol w:w="3210"/>
-        <w:gridCol w:w="2445"/>
+        <w:gridCol w:w="885"/>
+        <w:gridCol w:w="1950"/>
+        <w:gridCol w:w="4290"/>
+        <w:gridCol w:w="1665"/>
         <w:tblGridChange w:id="0">
           <w:tblGrid>
-            <w:gridCol w:w="870"/>
-            <w:gridCol w:w="2265"/>
-            <w:gridCol w:w="3210"/>
-            <w:gridCol w:w="2445"/>
+            <w:gridCol w:w="885"/>
+            <w:gridCol w:w="1950"/>
+            <w:gridCol w:w="4290"/>
+            <w:gridCol w:w="1665"/>
           </w:tblGrid>
         </w:tblGridChange>
       </w:tblGrid>
       <w:tr>
         <w:trPr>
           <w:cantSplit w:val="0"/>
-          <w:trHeight w:val="1095" w:hRule="atLeast"/>
+          <w:trHeight w:val="1440" w:hRule="atLeast"/>
           <w:tblHeader w:val="0"/>
         </w:trPr>
         <w:tc>
           <w:tcPr>
             <w:tcBorders>
-              <w:top w:color="c4c7c5" w:space="0" w:sz="5" w:val="single"/>
-              <w:left w:color="c4c7c5" w:space="0" w:sz="5" w:val="single"/>
-              <w:bottom w:color="c4c7c5" w:space="0" w:sz="5" w:val="single"/>
-              <w:right w:color="c4c7c5" w:space="0" w:sz="5" w:val="single"/>
+              <w:top w:color="000000" w:space="0" w:sz="8" w:val="single"/>
+              <w:left w:color="000000" w:space="0" w:sz="8" w:val="single"/>
+              <w:bottom w:color="000000" w:space="0" w:sz="8" w:val="single"/>
+              <w:right w:color="000000" w:space="0" w:sz="8" w:val="single"/>
             </w:tcBorders>
+            <w:shd w:fill="auto" w:val="clear"/>
             <w:tcMar>
-              <w:top w:w="120.0" w:type="dxa"/>
+              <w:top w:w="100.0" w:type="dxa"/>
               <w:left w:w="180.0" w:type="dxa"/>
-              <w:bottom w:w="120.0" w:type="dxa"/>
+              <w:bottom w:w="100.0" w:type="dxa"/>
               <w:right w:w="180.0" w:type="dxa"/>
             </w:tcMar>
             <w:vAlign w:val="top"/>
           </w:tcPr>
           <w:p>
             <w:pPr>
-              <w:spacing w:after="480" w:before="0" w:line="276" w:lineRule="auto"/>
+              <w:spacing w:line="360" w:lineRule="auto"/>
               <w:jc w:val="left"/>
               <w:rPr/>
             </w:pPr>
@@ -5844,22 +5860,23 @@
         <w:tc>
           <w:tcPr>
             <w:tcBorders>
-              <w:top w:color="c4c7c5" w:space="0" w:sz="5" w:val="single"/>
-              <w:left w:color="c4c7c5" w:space="0" w:sz="5" w:val="single"/>
-              <w:bottom w:color="c4c7c5" w:space="0" w:sz="5" w:val="single"/>
-              <w:right w:color="c4c7c5" w:space="0" w:sz="5" w:val="single"/>
+              <w:top w:color="000000" w:space="0" w:sz="8" w:val="single"/>
+              <w:left w:color="000000" w:space="0" w:sz="8" w:val="single"/>
+              <w:bottom w:color="000000" w:space="0" w:sz="8" w:val="single"/>
+              <w:right w:color="000000" w:space="0" w:sz="8" w:val="single"/>
             </w:tcBorders>
+            <w:shd w:fill="auto" w:val="clear"/>
             <w:tcMar>
-              <w:top w:w="120.0" w:type="dxa"/>
+              <w:top w:w="100.0" w:type="dxa"/>
               <w:left w:w="180.0" w:type="dxa"/>
-              <w:bottom w:w="120.0" w:type="dxa"/>
+              <w:bottom w:w="100.0" w:type="dxa"/>
               <w:right w:w="180.0" w:type="dxa"/>
             </w:tcMar>
             <w:vAlign w:val="top"/>
           </w:tcPr>
           <w:p>
             <w:pPr>
-              <w:spacing w:after="480" w:before="0" w:line="276" w:lineRule="auto"/>
+              <w:spacing w:line="360" w:lineRule="auto"/>
               <w:jc w:val="left"/>
               <w:rPr/>
             </w:pPr>
@@ -5874,22 +5891,23 @@
         <w:tc>
           <w:tcPr>
             <w:tcBorders>
-              <w:top w:color="c4c7c5" w:space="0" w:sz="5" w:val="single"/>
-              <w:left w:color="c4c7c5" w:space="0" w:sz="5" w:val="single"/>
-              <w:bottom w:color="c4c7c5" w:space="0" w:sz="5" w:val="single"/>
-              <w:right w:color="c4c7c5" w:space="0" w:sz="5" w:val="single"/>
+              <w:top w:color="000000" w:space="0" w:sz="8" w:val="single"/>
+              <w:left w:color="000000" w:space="0" w:sz="8" w:val="single"/>
+              <w:bottom w:color="000000" w:space="0" w:sz="8" w:val="single"/>
+              <w:right w:color="000000" w:space="0" w:sz="8" w:val="single"/>
             </w:tcBorders>
+            <w:shd w:fill="auto" w:val="clear"/>
             <w:tcMar>
-              <w:top w:w="120.0" w:type="dxa"/>
+              <w:top w:w="100.0" w:type="dxa"/>
               <w:left w:w="180.0" w:type="dxa"/>
-              <w:bottom w:w="120.0" w:type="dxa"/>
+              <w:bottom w:w="100.0" w:type="dxa"/>
               <w:right w:w="180.0" w:type="dxa"/>
             </w:tcMar>
             <w:vAlign w:val="top"/>
           </w:tcPr>
           <w:p>
             <w:pPr>
-              <w:spacing w:after="480" w:before="0" w:line="276" w:lineRule="auto"/>
+              <w:spacing w:line="360" w:lineRule="auto"/>
               <w:jc w:val="left"/>
               <w:rPr/>
             </w:pPr>
@@ -5904,22 +5922,23 @@
         <w:tc>
           <w:tcPr>
             <w:tcBorders>
-              <w:top w:color="c4c7c5" w:space="0" w:sz="5" w:val="single"/>
-              <w:left w:color="c4c7c5" w:space="0" w:sz="5" w:val="single"/>
-              <w:bottom w:color="c4c7c5" w:space="0" w:sz="5" w:val="single"/>
-              <w:right w:color="c4c7c5" w:space="0" w:sz="5" w:val="single"/>
+              <w:top w:color="000000" w:space="0" w:sz="8" w:val="single"/>
+              <w:left w:color="000000" w:space="0" w:sz="8" w:val="single"/>
+              <w:bottom w:color="000000" w:space="0" w:sz="8" w:val="single"/>
+              <w:right w:color="000000" w:space="0" w:sz="8" w:val="single"/>
             </w:tcBorders>
+            <w:shd w:fill="auto" w:val="clear"/>
             <w:tcMar>
-              <w:top w:w="120.0" w:type="dxa"/>
+              <w:top w:w="100.0" w:type="dxa"/>
               <w:left w:w="180.0" w:type="dxa"/>
-              <w:bottom w:w="120.0" w:type="dxa"/>
+              <w:bottom w:w="100.0" w:type="dxa"/>
               <w:right w:w="180.0" w:type="dxa"/>
             </w:tcMar>
             <w:vAlign w:val="top"/>
           </w:tcPr>
           <w:p>
             <w:pPr>
-              <w:spacing w:after="480" w:before="0" w:line="276" w:lineRule="auto"/>
+              <w:spacing w:line="360" w:lineRule="auto"/>
               <w:jc w:val="left"/>
               <w:rPr/>
             </w:pPr>
@@ -5935,28 +5954,29 @@
       <w:tr>
         <w:trPr>
           <w:cantSplit w:val="0"/>
-          <w:trHeight w:val="90" w:hRule="atLeast"/>
+          <w:trHeight w:val="1440" w:hRule="atLeast"/>
           <w:tblHeader w:val="0"/>
         </w:trPr>
         <w:tc>
           <w:tcPr>
             <w:tcBorders>
-              <w:top w:color="c4c7c5" w:space="0" w:sz="5" w:val="single"/>
-              <w:left w:color="c4c7c5" w:space="0" w:sz="5" w:val="single"/>
-              <w:bottom w:color="c4c7c5" w:space="0" w:sz="5" w:val="single"/>
-              <w:right w:color="c4c7c5" w:space="0" w:sz="5" w:val="single"/>
+              <w:top w:color="000000" w:space="0" w:sz="8" w:val="single"/>
+              <w:left w:color="000000" w:space="0" w:sz="8" w:val="single"/>
+              <w:bottom w:color="000000" w:space="0" w:sz="8" w:val="single"/>
+              <w:right w:color="000000" w:space="0" w:sz="8" w:val="single"/>
             </w:tcBorders>
+            <w:shd w:fill="auto" w:val="clear"/>
             <w:tcMar>
-              <w:top w:w="120.0" w:type="dxa"/>
+              <w:top w:w="100.0" w:type="dxa"/>
               <w:left w:w="180.0" w:type="dxa"/>
-              <w:bottom w:w="120.0" w:type="dxa"/>
+              <w:bottom w:w="100.0" w:type="dxa"/>
               <w:right w:w="180.0" w:type="dxa"/>
             </w:tcMar>
             <w:vAlign w:val="top"/>
           </w:tcPr>
           <w:p>
             <w:pPr>
-              <w:spacing w:after="480" w:before="0" w:line="276" w:lineRule="auto"/>
+              <w:spacing w:line="360" w:lineRule="auto"/>
               <w:jc w:val="left"/>
               <w:rPr/>
             </w:pPr>
@@ -5971,22 +5991,23 @@
         <w:tc>
           <w:tcPr>
             <w:tcBorders>
-              <w:top w:color="c4c7c5" w:space="0" w:sz="5" w:val="single"/>
-              <w:left w:color="c4c7c5" w:space="0" w:sz="5" w:val="single"/>
-              <w:bottom w:color="c4c7c5" w:space="0" w:sz="5" w:val="single"/>
-              <w:right w:color="c4c7c5" w:space="0" w:sz="5" w:val="single"/>
+              <w:top w:color="000000" w:space="0" w:sz="8" w:val="single"/>
+              <w:left w:color="000000" w:space="0" w:sz="8" w:val="single"/>
+              <w:bottom w:color="000000" w:space="0" w:sz="8" w:val="single"/>
+              <w:right w:color="000000" w:space="0" w:sz="8" w:val="single"/>
             </w:tcBorders>
+            <w:shd w:fill="auto" w:val="clear"/>
             <w:tcMar>
-              <w:top w:w="120.0" w:type="dxa"/>
+              <w:top w:w="100.0" w:type="dxa"/>
               <w:left w:w="180.0" w:type="dxa"/>
-              <w:bottom w:w="120.0" w:type="dxa"/>
+              <w:bottom w:w="100.0" w:type="dxa"/>
               <w:right w:w="180.0" w:type="dxa"/>
             </w:tcMar>
             <w:vAlign w:val="top"/>
           </w:tcPr>
           <w:p>
             <w:pPr>
-              <w:spacing w:after="480" w:before="0" w:line="276" w:lineRule="auto"/>
+              <w:spacing w:line="360" w:lineRule="auto"/>
               <w:jc w:val="left"/>
               <w:rPr/>
             </w:pPr>
@@ -5994,29 +6015,30 @@
               <w:rPr>
                 <w:rtl w:val="0"/>
               </w:rPr>
-              <w:t xml:space="preserve">Màn hình chính (No User)</w:t>
+              <w:t xml:space="preserve">Màn hình Trang Chủ (Dò 1 vé số)</w:t>
             </w:r>
           </w:p>
         </w:tc>
         <w:tc>
           <w:tcPr>
             <w:tcBorders>
-              <w:top w:color="c4c7c5" w:space="0" w:sz="5" w:val="single"/>
-              <w:left w:color="c4c7c5" w:space="0" w:sz="5" w:val="single"/>
-              <w:bottom w:color="c4c7c5" w:space="0" w:sz="5" w:val="single"/>
-              <w:right w:color="c4c7c5" w:space="0" w:sz="5" w:val="single"/>
+              <w:top w:color="000000" w:space="0" w:sz="8" w:val="single"/>
+              <w:left w:color="000000" w:space="0" w:sz="8" w:val="single"/>
+              <w:bottom w:color="000000" w:space="0" w:sz="8" w:val="single"/>
+              <w:right w:color="000000" w:space="0" w:sz="8" w:val="single"/>
             </w:tcBorders>
+            <w:shd w:fill="auto" w:val="clear"/>
             <w:tcMar>
-              <w:top w:w="120.0" w:type="dxa"/>
+              <w:top w:w="100.0" w:type="dxa"/>
               <w:left w:w="180.0" w:type="dxa"/>
-              <w:bottom w:w="120.0" w:type="dxa"/>
+              <w:bottom w:w="100.0" w:type="dxa"/>
               <w:right w:w="180.0" w:type="dxa"/>
             </w:tcMar>
             <w:vAlign w:val="top"/>
           </w:tcPr>
           <w:p>
             <w:pPr>
-              <w:spacing w:after="480" w:before="0" w:line="276" w:lineRule="auto"/>
+              <w:spacing w:line="360" w:lineRule="auto"/>
               <w:jc w:val="left"/>
               <w:rPr/>
             </w:pPr>
@@ -6024,29 +6046,30 @@
               <w:rPr>
                 <w:rtl w:val="0"/>
               </w:rPr>
-              <w:t xml:space="preserve">Trang chủ công khai, cho phép tìm kiếm kết quả và truy cập đăng nhập.</w:t>
+              <w:t xml:space="preserve">Trang chủ công khai dành cho khách vãng lai (NO_USER). Cho phép dò nhanh 1 tờ vé số và click điều hướng sang Đăng nhập.</w:t>
             </w:r>
           </w:p>
         </w:tc>
         <w:tc>
           <w:tcPr>
             <w:tcBorders>
-              <w:top w:color="c4c7c5" w:space="0" w:sz="5" w:val="single"/>
-              <w:left w:color="c4c7c5" w:space="0" w:sz="5" w:val="single"/>
-              <w:bottom w:color="c4c7c5" w:space="0" w:sz="5" w:val="single"/>
-              <w:right w:color="c4c7c5" w:space="0" w:sz="5" w:val="single"/>
+              <w:top w:color="000000" w:space="0" w:sz="8" w:val="single"/>
+              <w:left w:color="000000" w:space="0" w:sz="8" w:val="single"/>
+              <w:bottom w:color="000000" w:space="0" w:sz="8" w:val="single"/>
+              <w:right w:color="000000" w:space="0" w:sz="8" w:val="single"/>
             </w:tcBorders>
+            <w:shd w:fill="auto" w:val="clear"/>
             <w:tcMar>
-              <w:top w:w="120.0" w:type="dxa"/>
+              <w:top w:w="100.0" w:type="dxa"/>
               <w:left w:w="180.0" w:type="dxa"/>
-              <w:bottom w:w="120.0" w:type="dxa"/>
+              <w:bottom w:w="100.0" w:type="dxa"/>
               <w:right w:w="180.0" w:type="dxa"/>
             </w:tcMar>
             <w:vAlign w:val="top"/>
           </w:tcPr>
           <w:p>
             <w:pPr>
-              <w:spacing w:after="480" w:before="0" w:line="276" w:lineRule="auto"/>
+              <w:spacing w:line="360" w:lineRule="auto"/>
               <w:jc w:val="left"/>
               <w:rPr/>
             </w:pPr>
@@ -6056,34 +6079,40 @@
               </w:rPr>
               <w:t xml:space="preserve">xskt.com.vn</w:t>
             </w:r>
+            <w:r>
+              <w:rPr>
+                <w:rtl w:val="0"/>
+              </w:rPr>
+            </w:r>
           </w:p>
         </w:tc>
       </w:tr>
       <w:tr>
         <w:trPr>
           <w:cantSplit w:val="0"/>
-          <w:trHeight w:val="1650" w:hRule="atLeast"/>
+          <w:trHeight w:val="1440" w:hRule="atLeast"/>
           <w:tblHeader w:val="0"/>
         </w:trPr>
         <w:tc>
           <w:tcPr>
             <w:tcBorders>
-              <w:top w:color="c4c7c5" w:space="0" w:sz="5" w:val="single"/>
-              <w:left w:color="c4c7c5" w:space="0" w:sz="5" w:val="single"/>
-              <w:bottom w:color="c4c7c5" w:space="0" w:sz="5" w:val="single"/>
-              <w:right w:color="c4c7c5" w:space="0" w:sz="5" w:val="single"/>
+              <w:top w:color="000000" w:space="0" w:sz="8" w:val="single"/>
+              <w:left w:color="000000" w:space="0" w:sz="8" w:val="single"/>
+              <w:bottom w:color="000000" w:space="0" w:sz="8" w:val="single"/>
+              <w:right w:color="000000" w:space="0" w:sz="8" w:val="single"/>
             </w:tcBorders>
+            <w:shd w:fill="auto" w:val="clear"/>
             <w:tcMar>
-              <w:top w:w="120.0" w:type="dxa"/>
+              <w:top w:w="100.0" w:type="dxa"/>
               <w:left w:w="180.0" w:type="dxa"/>
-              <w:bottom w:w="120.0" w:type="dxa"/>
+              <w:bottom w:w="100.0" w:type="dxa"/>
               <w:right w:w="180.0" w:type="dxa"/>
             </w:tcMar>
             <w:vAlign w:val="top"/>
           </w:tcPr>
           <w:p>
             <w:pPr>
-              <w:spacing w:after="480" w:before="0" w:line="276" w:lineRule="auto"/>
+              <w:spacing w:line="360" w:lineRule="auto"/>
               <w:jc w:val="left"/>
               <w:rPr/>
             </w:pPr>
@@ -6098,22 +6127,23 @@
         <w:tc>
           <w:tcPr>
             <w:tcBorders>
-              <w:top w:color="c4c7c5" w:space="0" w:sz="5" w:val="single"/>
-              <w:left w:color="c4c7c5" w:space="0" w:sz="5" w:val="single"/>
-              <w:bottom w:color="c4c7c5" w:space="0" w:sz="5" w:val="single"/>
-              <w:right w:color="c4c7c5" w:space="0" w:sz="5" w:val="single"/>
+              <w:top w:color="000000" w:space="0" w:sz="8" w:val="single"/>
+              <w:left w:color="000000" w:space="0" w:sz="8" w:val="single"/>
+              <w:bottom w:color="000000" w:space="0" w:sz="8" w:val="single"/>
+              <w:right w:color="000000" w:space="0" w:sz="8" w:val="single"/>
             </w:tcBorders>
+            <w:shd w:fill="auto" w:val="clear"/>
             <w:tcMar>
-              <w:top w:w="120.0" w:type="dxa"/>
+              <w:top w:w="100.0" w:type="dxa"/>
               <w:left w:w="180.0" w:type="dxa"/>
-              <w:bottom w:w="120.0" w:type="dxa"/>
+              <w:bottom w:w="100.0" w:type="dxa"/>
               <w:right w:w="180.0" w:type="dxa"/>
             </w:tcMar>
             <w:vAlign w:val="top"/>
           </w:tcPr>
           <w:p>
             <w:pPr>
-              <w:spacing w:after="480" w:before="0" w:line="276" w:lineRule="auto"/>
+              <w:spacing w:line="360" w:lineRule="auto"/>
               <w:jc w:val="left"/>
               <w:rPr/>
             </w:pPr>
@@ -6128,22 +6158,23 @@
         <w:tc>
           <w:tcPr>
             <w:tcBorders>
-              <w:top w:color="c4c7c5" w:space="0" w:sz="5" w:val="single"/>
-              <w:left w:color="c4c7c5" w:space="0" w:sz="5" w:val="single"/>
-              <w:bottom w:color="c4c7c5" w:space="0" w:sz="5" w:val="single"/>
-              <w:right w:color="c4c7c5" w:space="0" w:sz="5" w:val="single"/>
+              <w:top w:color="000000" w:space="0" w:sz="8" w:val="single"/>
+              <w:left w:color="000000" w:space="0" w:sz="8" w:val="single"/>
+              <w:bottom w:color="000000" w:space="0" w:sz="8" w:val="single"/>
+              <w:right w:color="000000" w:space="0" w:sz="8" w:val="single"/>
             </w:tcBorders>
+            <w:shd w:fill="auto" w:val="clear"/>
             <w:tcMar>
-              <w:top w:w="120.0" w:type="dxa"/>
+              <w:top w:w="100.0" w:type="dxa"/>
               <w:left w:w="180.0" w:type="dxa"/>
-              <w:bottom w:w="120.0" w:type="dxa"/>
+              <w:bottom w:w="100.0" w:type="dxa"/>
               <w:right w:w="180.0" w:type="dxa"/>
             </w:tcMar>
             <w:vAlign w:val="top"/>
           </w:tcPr>
           <w:p>
             <w:pPr>
-              <w:spacing w:after="480" w:before="0" w:line="276" w:lineRule="auto"/>
+              <w:spacing w:line="360" w:lineRule="auto"/>
               <w:jc w:val="left"/>
               <w:rPr/>
             </w:pPr>
@@ -6151,29 +6182,30 @@
               <w:rPr>
                 <w:rtl w:val="0"/>
               </w:rPr>
-              <w:t xml:space="preserve">Form xác thực vào hệ thống (Local/Social). Từ đây có thể chuyển sang Đăng ký hoặc Quên MK.</w:t>
+              <w:t xml:space="preserve">Giao diện để người dùng xác thực tài khoản qua hình thức nội bộ (Email/Mật khẩu) hoặc đăng nhập nhanh bằng Google/Facebook.</w:t>
             </w:r>
           </w:p>
         </w:tc>
         <w:tc>
           <w:tcPr>
             <w:tcBorders>
-              <w:top w:color="c4c7c5" w:space="0" w:sz="5" w:val="single"/>
-              <w:left w:color="c4c7c5" w:space="0" w:sz="5" w:val="single"/>
-              <w:bottom w:color="c4c7c5" w:space="0" w:sz="5" w:val="single"/>
-              <w:right w:color="c4c7c5" w:space="0" w:sz="5" w:val="single"/>
+              <w:top w:color="000000" w:space="0" w:sz="8" w:val="single"/>
+              <w:left w:color="000000" w:space="0" w:sz="8" w:val="single"/>
+              <w:bottom w:color="000000" w:space="0" w:sz="8" w:val="single"/>
+              <w:right w:color="000000" w:space="0" w:sz="8" w:val="single"/>
             </w:tcBorders>
+            <w:shd w:fill="auto" w:val="clear"/>
             <w:tcMar>
-              <w:top w:w="120.0" w:type="dxa"/>
+              <w:top w:w="100.0" w:type="dxa"/>
               <w:left w:w="180.0" w:type="dxa"/>
-              <w:bottom w:w="120.0" w:type="dxa"/>
+              <w:bottom w:w="100.0" w:type="dxa"/>
               <w:right w:w="180.0" w:type="dxa"/>
             </w:tcMar>
             <w:vAlign w:val="top"/>
           </w:tcPr>
           <w:p>
             <w:pPr>
-              <w:spacing w:after="480" w:before="0" w:line="276" w:lineRule="auto"/>
+              <w:spacing w:line="360" w:lineRule="auto"/>
               <w:jc w:val="left"/>
               <w:rPr/>
             </w:pPr>
@@ -6189,28 +6221,29 @@
       <w:tr>
         <w:trPr>
           <w:cantSplit w:val="0"/>
-          <w:trHeight w:val="1365" w:hRule="atLeast"/>
+          <w:trHeight w:val="810" w:hRule="atLeast"/>
           <w:tblHeader w:val="0"/>
         </w:trPr>
         <w:tc>
           <w:tcPr>
             <w:tcBorders>
-              <w:top w:color="c4c7c5" w:space="0" w:sz="5" w:val="single"/>
-              <w:left w:color="c4c7c5" w:space="0" w:sz="5" w:val="single"/>
-              <w:bottom w:color="c4c7c5" w:space="0" w:sz="5" w:val="single"/>
-              <w:right w:color="c4c7c5" w:space="0" w:sz="5" w:val="single"/>
+              <w:top w:color="000000" w:space="0" w:sz="8" w:val="single"/>
+              <w:left w:color="000000" w:space="0" w:sz="8" w:val="single"/>
+              <w:bottom w:color="000000" w:space="0" w:sz="8" w:val="single"/>
+              <w:right w:color="000000" w:space="0" w:sz="8" w:val="single"/>
             </w:tcBorders>
+            <w:shd w:fill="auto" w:val="clear"/>
             <w:tcMar>
-              <w:top w:w="120.0" w:type="dxa"/>
+              <w:top w:w="100.0" w:type="dxa"/>
               <w:left w:w="180.0" w:type="dxa"/>
-              <w:bottom w:w="120.0" w:type="dxa"/>
+              <w:bottom w:w="100.0" w:type="dxa"/>
               <w:right w:w="180.0" w:type="dxa"/>
             </w:tcMar>
             <w:vAlign w:val="top"/>
           </w:tcPr>
           <w:p>
             <w:pPr>
-              <w:spacing w:after="480" w:before="0" w:line="276" w:lineRule="auto"/>
+              <w:spacing w:line="360" w:lineRule="auto"/>
               <w:jc w:val="left"/>
               <w:rPr/>
             </w:pPr>
@@ -6225,22 +6258,23 @@
         <w:tc>
           <w:tcPr>
             <w:tcBorders>
-              <w:top w:color="c4c7c5" w:space="0" w:sz="5" w:val="single"/>
-              <w:left w:color="c4c7c5" w:space="0" w:sz="5" w:val="single"/>
-              <w:bottom w:color="c4c7c5" w:space="0" w:sz="5" w:val="single"/>
-              <w:right w:color="c4c7c5" w:space="0" w:sz="5" w:val="single"/>
+              <w:top w:color="000000" w:space="0" w:sz="8" w:val="single"/>
+              <w:left w:color="000000" w:space="0" w:sz="8" w:val="single"/>
+              <w:bottom w:color="000000" w:space="0" w:sz="8" w:val="single"/>
+              <w:right w:color="000000" w:space="0" w:sz="8" w:val="single"/>
             </w:tcBorders>
+            <w:shd w:fill="auto" w:val="clear"/>
             <w:tcMar>
-              <w:top w:w="120.0" w:type="dxa"/>
+              <w:top w:w="100.0" w:type="dxa"/>
               <w:left w:w="180.0" w:type="dxa"/>
-              <w:bottom w:w="120.0" w:type="dxa"/>
+              <w:bottom w:w="100.0" w:type="dxa"/>
               <w:right w:w="180.0" w:type="dxa"/>
             </w:tcMar>
             <w:vAlign w:val="top"/>
           </w:tcPr>
           <w:p>
             <w:pPr>
-              <w:spacing w:after="480" w:before="0" w:line="276" w:lineRule="auto"/>
+              <w:spacing w:line="360" w:lineRule="auto"/>
               <w:jc w:val="left"/>
               <w:rPr/>
             </w:pPr>
@@ -6248,29 +6282,30 @@
               <w:rPr>
                 <w:rtl w:val="0"/>
               </w:rPr>
-              <w:t xml:space="preserve">Màn hình Đăng ký / Quên MK</w:t>
+              <w:t xml:space="preserve">Màn hình Đăng ký</w:t>
             </w:r>
           </w:p>
         </w:tc>
         <w:tc>
           <w:tcPr>
             <w:tcBorders>
-              <w:top w:color="c4c7c5" w:space="0" w:sz="5" w:val="single"/>
-              <w:left w:color="c4c7c5" w:space="0" w:sz="5" w:val="single"/>
-              <w:bottom w:color="c4c7c5" w:space="0" w:sz="5" w:val="single"/>
-              <w:right w:color="c4c7c5" w:space="0" w:sz="5" w:val="single"/>
+              <w:top w:color="000000" w:space="0" w:sz="8" w:val="single"/>
+              <w:left w:color="000000" w:space="0" w:sz="8" w:val="single"/>
+              <w:bottom w:color="000000" w:space="0" w:sz="8" w:val="single"/>
+              <w:right w:color="000000" w:space="0" w:sz="8" w:val="single"/>
             </w:tcBorders>
+            <w:shd w:fill="auto" w:val="clear"/>
             <w:tcMar>
-              <w:top w:w="120.0" w:type="dxa"/>
+              <w:top w:w="100.0" w:type="dxa"/>
               <w:left w:w="180.0" w:type="dxa"/>
-              <w:bottom w:w="120.0" w:type="dxa"/>
+              <w:bottom w:w="100.0" w:type="dxa"/>
               <w:right w:w="180.0" w:type="dxa"/>
             </w:tcMar>
             <w:vAlign w:val="top"/>
           </w:tcPr>
           <w:p>
             <w:pPr>
-              <w:spacing w:after="480" w:before="0" w:line="276" w:lineRule="auto"/>
+              <w:spacing w:line="360" w:lineRule="auto"/>
               <w:jc w:val="left"/>
               <w:rPr/>
             </w:pPr>
@@ -6278,29 +6313,30 @@
               <w:rPr>
                 <w:rtl w:val="0"/>
               </w:rPr>
-              <w:t xml:space="preserve">Cung cấp form tạo tài khoản mới hoặc form nhận mã OTP để lấy lại mật khẩu.</w:t>
+              <w:t xml:space="preserve">Form cho phép khách vãng lai đăng ký tài khoản thành viên mới.</w:t>
             </w:r>
           </w:p>
         </w:tc>
         <w:tc>
           <w:tcPr>
             <w:tcBorders>
-              <w:top w:color="c4c7c5" w:space="0" w:sz="5" w:val="single"/>
-              <w:left w:color="c4c7c5" w:space="0" w:sz="5" w:val="single"/>
-              <w:bottom w:color="c4c7c5" w:space="0" w:sz="5" w:val="single"/>
-              <w:right w:color="c4c7c5" w:space="0" w:sz="5" w:val="single"/>
+              <w:top w:color="000000" w:space="0" w:sz="8" w:val="single"/>
+              <w:left w:color="000000" w:space="0" w:sz="8" w:val="single"/>
+              <w:bottom w:color="000000" w:space="0" w:sz="8" w:val="single"/>
+              <w:right w:color="000000" w:space="0" w:sz="8" w:val="single"/>
             </w:tcBorders>
+            <w:shd w:fill="auto" w:val="clear"/>
             <w:tcMar>
-              <w:top w:w="120.0" w:type="dxa"/>
+              <w:top w:w="100.0" w:type="dxa"/>
               <w:left w:w="180.0" w:type="dxa"/>
-              <w:bottom w:w="120.0" w:type="dxa"/>
+              <w:bottom w:w="100.0" w:type="dxa"/>
               <w:right w:w="180.0" w:type="dxa"/>
             </w:tcMar>
             <w:vAlign w:val="top"/>
           </w:tcPr>
           <w:p>
             <w:pPr>
-              <w:spacing w:after="480" w:before="0" w:line="276" w:lineRule="auto"/>
+              <w:spacing w:line="360" w:lineRule="auto"/>
               <w:jc w:val="left"/>
               <w:rPr/>
             </w:pPr>
@@ -6316,28 +6352,29 @@
       <w:tr>
         <w:trPr>
           <w:cantSplit w:val="0"/>
-          <w:trHeight w:val="1650" w:hRule="atLeast"/>
+          <w:trHeight w:val="1125" w:hRule="atLeast"/>
           <w:tblHeader w:val="0"/>
         </w:trPr>
         <w:tc>
           <w:tcPr>
             <w:tcBorders>
-              <w:top w:color="c4c7c5" w:space="0" w:sz="5" w:val="single"/>
-              <w:left w:color="c4c7c5" w:space="0" w:sz="5" w:val="single"/>
-              <w:bottom w:color="c4c7c5" w:space="0" w:sz="5" w:val="single"/>
-              <w:right w:color="c4c7c5" w:space="0" w:sz="5" w:val="single"/>
+              <w:top w:color="000000" w:space="0" w:sz="8" w:val="single"/>
+              <w:left w:color="000000" w:space="0" w:sz="8" w:val="single"/>
+              <w:bottom w:color="000000" w:space="0" w:sz="8" w:val="single"/>
+              <w:right w:color="000000" w:space="0" w:sz="8" w:val="single"/>
             </w:tcBorders>
+            <w:shd w:fill="auto" w:val="clear"/>
             <w:tcMar>
-              <w:top w:w="120.0" w:type="dxa"/>
+              <w:top w:w="100.0" w:type="dxa"/>
               <w:left w:w="180.0" w:type="dxa"/>
-              <w:bottom w:w="120.0" w:type="dxa"/>
+              <w:bottom w:w="100.0" w:type="dxa"/>
               <w:right w:w="180.0" w:type="dxa"/>
             </w:tcMar>
             <w:vAlign w:val="top"/>
           </w:tcPr>
           <w:p>
             <w:pPr>
-              <w:spacing w:after="480" w:before="0" w:line="276" w:lineRule="auto"/>
+              <w:spacing w:line="360" w:lineRule="auto"/>
               <w:jc w:val="left"/>
               <w:rPr/>
             </w:pPr>
@@ -6352,22 +6389,23 @@
         <w:tc>
           <w:tcPr>
             <w:tcBorders>
-              <w:top w:color="c4c7c5" w:space="0" w:sz="5" w:val="single"/>
-              <w:left w:color="c4c7c5" w:space="0" w:sz="5" w:val="single"/>
-              <w:bottom w:color="c4c7c5" w:space="0" w:sz="5" w:val="single"/>
-              <w:right w:color="c4c7c5" w:space="0" w:sz="5" w:val="single"/>
+              <w:top w:color="000000" w:space="0" w:sz="8" w:val="single"/>
+              <w:left w:color="000000" w:space="0" w:sz="8" w:val="single"/>
+              <w:bottom w:color="000000" w:space="0" w:sz="8" w:val="single"/>
+              <w:right w:color="000000" w:space="0" w:sz="8" w:val="single"/>
             </w:tcBorders>
+            <w:shd w:fill="auto" w:val="clear"/>
             <w:tcMar>
-              <w:top w:w="120.0" w:type="dxa"/>
+              <w:top w:w="100.0" w:type="dxa"/>
               <w:left w:w="180.0" w:type="dxa"/>
-              <w:bottom w:w="120.0" w:type="dxa"/>
+              <w:bottom w:w="100.0" w:type="dxa"/>
               <w:right w:w="180.0" w:type="dxa"/>
             </w:tcMar>
             <w:vAlign w:val="top"/>
           </w:tcPr>
           <w:p>
             <w:pPr>
-              <w:spacing w:after="480" w:before="0" w:line="276" w:lineRule="auto"/>
+              <w:spacing w:line="360" w:lineRule="auto"/>
               <w:jc w:val="left"/>
               <w:rPr/>
             </w:pPr>
@@ -6375,29 +6413,30 @@
               <w:rPr>
                 <w:rtl w:val="0"/>
               </w:rPr>
-              <w:t xml:space="preserve">Màn hình chính (User/Admin)</w:t>
+              <w:t xml:space="preserve">Màn hình Quên mật khẩu</w:t>
             </w:r>
           </w:p>
         </w:tc>
         <w:tc>
           <w:tcPr>
             <w:tcBorders>
-              <w:top w:color="c4c7c5" w:space="0" w:sz="5" w:val="single"/>
-              <w:left w:color="c4c7c5" w:space="0" w:sz="5" w:val="single"/>
-              <w:bottom w:color="c4c7c5" w:space="0" w:sz="5" w:val="single"/>
-              <w:right w:color="c4c7c5" w:space="0" w:sz="5" w:val="single"/>
+              <w:top w:color="000000" w:space="0" w:sz="8" w:val="single"/>
+              <w:left w:color="000000" w:space="0" w:sz="8" w:val="single"/>
+              <w:bottom w:color="000000" w:space="0" w:sz="8" w:val="single"/>
+              <w:right w:color="000000" w:space="0" w:sz="8" w:val="single"/>
             </w:tcBorders>
+            <w:shd w:fill="auto" w:val="clear"/>
             <w:tcMar>
-              <w:top w:w="120.0" w:type="dxa"/>
+              <w:top w:w="100.0" w:type="dxa"/>
               <w:left w:w="180.0" w:type="dxa"/>
-              <w:bottom w:w="120.0" w:type="dxa"/>
+              <w:bottom w:w="100.0" w:type="dxa"/>
               <w:right w:w="180.0" w:type="dxa"/>
             </w:tcMar>
             <w:vAlign w:val="top"/>
           </w:tcPr>
           <w:p>
             <w:pPr>
-              <w:spacing w:after="480" w:before="0" w:line="276" w:lineRule="auto"/>
+              <w:spacing w:line="360" w:lineRule="auto"/>
               <w:jc w:val="left"/>
               <w:rPr/>
             </w:pPr>
@@ -6405,29 +6444,30 @@
               <w:rPr>
                 <w:rtl w:val="0"/>
               </w:rPr>
-              <w:t xml:space="preserve">Trang chủ cho người dùng đã đăng nhập, tích hợp các tính năng tra cứu vé số cá nhân hóa.</w:t>
+              <w:t xml:space="preserve">Giao diện cho phép người dùng nhập Email, nhận mã OTP về hòm thư điện tử và thiết lập lại mật khẩu mới.</w:t>
             </w:r>
           </w:p>
         </w:tc>
         <w:tc>
           <w:tcPr>
             <w:tcBorders>
-              <w:top w:color="c4c7c5" w:space="0" w:sz="5" w:val="single"/>
-              <w:left w:color="c4c7c5" w:space="0" w:sz="5" w:val="single"/>
-              <w:bottom w:color="c4c7c5" w:space="0" w:sz="5" w:val="single"/>
-              <w:right w:color="c4c7c5" w:space="0" w:sz="5" w:val="single"/>
+              <w:top w:color="000000" w:space="0" w:sz="8" w:val="single"/>
+              <w:left w:color="000000" w:space="0" w:sz="8" w:val="single"/>
+              <w:bottom w:color="000000" w:space="0" w:sz="8" w:val="single"/>
+              <w:right w:color="000000" w:space="0" w:sz="8" w:val="single"/>
             </w:tcBorders>
+            <w:shd w:fill="auto" w:val="clear"/>
             <w:tcMar>
-              <w:top w:w="120.0" w:type="dxa"/>
+              <w:top w:w="100.0" w:type="dxa"/>
               <w:left w:w="180.0" w:type="dxa"/>
-              <w:bottom w:w="120.0" w:type="dxa"/>
+              <w:bottom w:w="100.0" w:type="dxa"/>
               <w:right w:w="180.0" w:type="dxa"/>
             </w:tcMar>
             <w:vAlign w:val="top"/>
           </w:tcPr>
           <w:p>
             <w:pPr>
-              <w:spacing w:after="480" w:before="0" w:line="276" w:lineRule="auto"/>
+              <w:spacing w:line="360" w:lineRule="auto"/>
               <w:jc w:val="left"/>
               <w:rPr/>
             </w:pPr>
@@ -6435,7 +6475,7 @@
               <w:rPr>
                 <w:rtl w:val="0"/>
               </w:rPr>
-              <w:t xml:space="preserve">Tự thiết kế</w:t>
+              <w:t xml:space="preserve">Mẫu chuẩn</w:t>
             </w:r>
           </w:p>
         </w:tc>
@@ -6443,28 +6483,29 @@
       <w:tr>
         <w:trPr>
           <w:cantSplit w:val="0"/>
-          <w:trHeight w:val="1365" w:hRule="atLeast"/>
+          <w:trHeight w:val="1440" w:hRule="atLeast"/>
           <w:tblHeader w:val="0"/>
         </w:trPr>
         <w:tc>
           <w:tcPr>
             <w:tcBorders>
-              <w:top w:color="c4c7c5" w:space="0" w:sz="5" w:val="single"/>
-              <w:left w:color="c4c7c5" w:space="0" w:sz="5" w:val="single"/>
-              <w:bottom w:color="c4c7c5" w:space="0" w:sz="5" w:val="single"/>
-              <w:right w:color="c4c7c5" w:space="0" w:sz="5" w:val="single"/>
+              <w:top w:color="000000" w:space="0" w:sz="8" w:val="single"/>
+              <w:left w:color="000000" w:space="0" w:sz="8" w:val="single"/>
+              <w:bottom w:color="000000" w:space="0" w:sz="8" w:val="single"/>
+              <w:right w:color="000000" w:space="0" w:sz="8" w:val="single"/>
             </w:tcBorders>
+            <w:shd w:fill="auto" w:val="clear"/>
             <w:tcMar>
-              <w:top w:w="120.0" w:type="dxa"/>
+              <w:top w:w="100.0" w:type="dxa"/>
               <w:left w:w="180.0" w:type="dxa"/>
-              <w:bottom w:w="120.0" w:type="dxa"/>
+              <w:bottom w:w="100.0" w:type="dxa"/>
               <w:right w:w="180.0" w:type="dxa"/>
             </w:tcMar>
             <w:vAlign w:val="top"/>
           </w:tcPr>
           <w:p>
             <w:pPr>
-              <w:spacing w:after="480" w:before="0" w:line="276" w:lineRule="auto"/>
+              <w:spacing w:line="360" w:lineRule="auto"/>
               <w:jc w:val="left"/>
               <w:rPr/>
             </w:pPr>
@@ -6479,22 +6520,23 @@
         <w:tc>
           <w:tcPr>
             <w:tcBorders>
-              <w:top w:color="c4c7c5" w:space="0" w:sz="5" w:val="single"/>
-              <w:left w:color="c4c7c5" w:space="0" w:sz="5" w:val="single"/>
-              <w:bottom w:color="c4c7c5" w:space="0" w:sz="5" w:val="single"/>
-              <w:right w:color="c4c7c5" w:space="0" w:sz="5" w:val="single"/>
+              <w:top w:color="000000" w:space="0" w:sz="8" w:val="single"/>
+              <w:left w:color="000000" w:space="0" w:sz="8" w:val="single"/>
+              <w:bottom w:color="000000" w:space="0" w:sz="8" w:val="single"/>
+              <w:right w:color="000000" w:space="0" w:sz="8" w:val="single"/>
             </w:tcBorders>
+            <w:shd w:fill="auto" w:val="clear"/>
             <w:tcMar>
-              <w:top w:w="120.0" w:type="dxa"/>
+              <w:top w:w="100.0" w:type="dxa"/>
               <w:left w:w="180.0" w:type="dxa"/>
-              <w:bottom w:w="120.0" w:type="dxa"/>
+              <w:bottom w:w="100.0" w:type="dxa"/>
               <w:right w:w="180.0" w:type="dxa"/>
             </w:tcMar>
             <w:vAlign w:val="top"/>
           </w:tcPr>
           <w:p>
             <w:pPr>
-              <w:spacing w:after="480" w:before="0" w:line="276" w:lineRule="auto"/>
+              <w:spacing w:line="360" w:lineRule="auto"/>
               <w:jc w:val="left"/>
               <w:rPr/>
             </w:pPr>
@@ -6502,29 +6544,30 @@
               <w:rPr>
                 <w:rtl w:val="0"/>
               </w:rPr>
-              <w:t xml:space="preserve">Dò 1 vé / Dò nhiều vé</w:t>
+              <w:t xml:space="preserve">Màn hình Trang Chủ (Dò nâng cao)</w:t>
             </w:r>
           </w:p>
         </w:tc>
         <w:tc>
           <w:tcPr>
             <w:tcBorders>
-              <w:top w:color="c4c7c5" w:space="0" w:sz="5" w:val="single"/>
-              <w:left w:color="c4c7c5" w:space="0" w:sz="5" w:val="single"/>
-              <w:bottom w:color="c4c7c5" w:space="0" w:sz="5" w:val="single"/>
-              <w:right w:color="c4c7c5" w:space="0" w:sz="5" w:val="single"/>
+              <w:top w:color="000000" w:space="0" w:sz="8" w:val="single"/>
+              <w:left w:color="000000" w:space="0" w:sz="8" w:val="single"/>
+              <w:bottom w:color="000000" w:space="0" w:sz="8" w:val="single"/>
+              <w:right w:color="000000" w:space="0" w:sz="8" w:val="single"/>
             </w:tcBorders>
+            <w:shd w:fill="auto" w:val="clear"/>
             <w:tcMar>
-              <w:top w:w="120.0" w:type="dxa"/>
+              <w:top w:w="100.0" w:type="dxa"/>
               <w:left w:w="180.0" w:type="dxa"/>
-              <w:bottom w:w="120.0" w:type="dxa"/>
+              <w:bottom w:w="100.0" w:type="dxa"/>
               <w:right w:w="180.0" w:type="dxa"/>
             </w:tcMar>
             <w:vAlign w:val="top"/>
           </w:tcPr>
           <w:p>
             <w:pPr>
-              <w:spacing w:after="480" w:before="0" w:line="276" w:lineRule="auto"/>
+              <w:spacing w:line="360" w:lineRule="auto"/>
               <w:jc w:val="left"/>
               <w:rPr/>
             </w:pPr>
@@ -6532,29 +6575,30 @@
               <w:rPr>
                 <w:rtl w:val="0"/>
               </w:rPr>
-              <w:t xml:space="preserve">Khu vực nhập liệu dãy số vé số (1 ô đối với dò thường, nhiều ô đối với dò hàng loạt).</w:t>
+              <w:t xml:space="preserve">Giao diện trang chủ sau khi đăng nhập thành công của USER và ADMIN. Cho phép thêm nhiều dòng để dò hàng loạt vé số cùng lúc.</w:t>
             </w:r>
           </w:p>
         </w:tc>
         <w:tc>
           <w:tcPr>
             <w:tcBorders>
-              <w:top w:color="c4c7c5" w:space="0" w:sz="5" w:val="single"/>
-              <w:left w:color="c4c7c5" w:space="0" w:sz="5" w:val="single"/>
-              <w:bottom w:color="c4c7c5" w:space="0" w:sz="5" w:val="single"/>
-              <w:right w:color="c4c7c5" w:space="0" w:sz="5" w:val="single"/>
+              <w:top w:color="000000" w:space="0" w:sz="8" w:val="single"/>
+              <w:left w:color="000000" w:space="0" w:sz="8" w:val="single"/>
+              <w:bottom w:color="000000" w:space="0" w:sz="8" w:val="single"/>
+              <w:right w:color="000000" w:space="0" w:sz="8" w:val="single"/>
             </w:tcBorders>
+            <w:shd w:fill="auto" w:val="clear"/>
             <w:tcMar>
-              <w:top w:w="120.0" w:type="dxa"/>
+              <w:top w:w="100.0" w:type="dxa"/>
               <w:left w:w="180.0" w:type="dxa"/>
-              <w:bottom w:w="120.0" w:type="dxa"/>
+              <w:bottom w:w="100.0" w:type="dxa"/>
               <w:right w:w="180.0" w:type="dxa"/>
             </w:tcMar>
             <w:vAlign w:val="top"/>
           </w:tcPr>
           <w:p>
             <w:pPr>
-              <w:spacing w:after="480" w:before="0" w:line="276" w:lineRule="auto"/>
+              <w:spacing w:line="360" w:lineRule="auto"/>
               <w:jc w:val="left"/>
               <w:rPr/>
             </w:pPr>
@@ -6564,34 +6608,40 @@
               </w:rPr>
               <w:t xml:space="preserve">xskt.com.vn/do-ve-so</w:t>
             </w:r>
+            <w:r>
+              <w:rPr>
+                <w:rtl w:val="0"/>
+              </w:rPr>
+            </w:r>
           </w:p>
         </w:tc>
       </w:tr>
       <w:tr>
         <w:trPr>
           <w:cantSplit w:val="0"/>
-          <w:trHeight w:val="1650" w:hRule="atLeast"/>
+          <w:trHeight w:val="1125" w:hRule="atLeast"/>
           <w:tblHeader w:val="0"/>
         </w:trPr>
         <w:tc>
           <w:tcPr>
             <w:tcBorders>
-              <w:top w:color="c4c7c5" w:space="0" w:sz="5" w:val="single"/>
-              <w:left w:color="c4c7c5" w:space="0" w:sz="5" w:val="single"/>
-              <w:bottom w:color="c4c7c5" w:space="0" w:sz="5" w:val="single"/>
-              <w:right w:color="c4c7c5" w:space="0" w:sz="5" w:val="single"/>
+              <w:top w:color="000000" w:space="0" w:sz="8" w:val="single"/>
+              <w:left w:color="000000" w:space="0" w:sz="8" w:val="single"/>
+              <w:bottom w:color="000000" w:space="0" w:sz="8" w:val="single"/>
+              <w:right w:color="000000" w:space="0" w:sz="8" w:val="single"/>
             </w:tcBorders>
+            <w:shd w:fill="auto" w:val="clear"/>
             <w:tcMar>
-              <w:top w:w="120.0" w:type="dxa"/>
+              <w:top w:w="100.0" w:type="dxa"/>
               <w:left w:w="180.0" w:type="dxa"/>
-              <w:bottom w:w="120.0" w:type="dxa"/>
+              <w:bottom w:w="100.0" w:type="dxa"/>
               <w:right w:w="180.0" w:type="dxa"/>
             </w:tcMar>
             <w:vAlign w:val="top"/>
           </w:tcPr>
           <w:p>
             <w:pPr>
-              <w:spacing w:after="480" w:before="0" w:line="276" w:lineRule="auto"/>
+              <w:spacing w:line="360" w:lineRule="auto"/>
               <w:jc w:val="left"/>
               <w:rPr/>
             </w:pPr>
@@ -6606,22 +6656,23 @@
         <w:tc>
           <w:tcPr>
             <w:tcBorders>
-              <w:top w:color="c4c7c5" w:space="0" w:sz="5" w:val="single"/>
-              <w:left w:color="c4c7c5" w:space="0" w:sz="5" w:val="single"/>
-              <w:bottom w:color="c4c7c5" w:space="0" w:sz="5" w:val="single"/>
-              <w:right w:color="c4c7c5" w:space="0" w:sz="5" w:val="single"/>
+              <w:top w:color="000000" w:space="0" w:sz="8" w:val="single"/>
+              <w:left w:color="000000" w:space="0" w:sz="8" w:val="single"/>
+              <w:bottom w:color="000000" w:space="0" w:sz="8" w:val="single"/>
+              <w:right w:color="000000" w:space="0" w:sz="8" w:val="single"/>
             </w:tcBorders>
+            <w:shd w:fill="auto" w:val="clear"/>
             <w:tcMar>
-              <w:top w:w="120.0" w:type="dxa"/>
+              <w:top w:w="100.0" w:type="dxa"/>
               <w:left w:w="180.0" w:type="dxa"/>
-              <w:bottom w:w="120.0" w:type="dxa"/>
+              <w:bottom w:w="100.0" w:type="dxa"/>
               <w:right w:w="180.0" w:type="dxa"/>
             </w:tcMar>
             <w:vAlign w:val="top"/>
           </w:tcPr>
           <w:p>
             <w:pPr>
-              <w:spacing w:after="480" w:before="0" w:line="276" w:lineRule="auto"/>
+              <w:spacing w:line="360" w:lineRule="auto"/>
               <w:jc w:val="left"/>
               <w:rPr/>
             </w:pPr>
@@ -6629,29 +6680,30 @@
               <w:rPr>
                 <w:rtl w:val="0"/>
               </w:rPr>
-              <w:t xml:space="preserve">Kết quả vé số</w:t>
+              <w:t xml:space="preserve">Màn hình Thông tin của tôi</w:t>
             </w:r>
           </w:p>
         </w:tc>
         <w:tc>
           <w:tcPr>
             <w:tcBorders>
-              <w:top w:color="c4c7c5" w:space="0" w:sz="5" w:val="single"/>
-              <w:left w:color="c4c7c5" w:space="0" w:sz="5" w:val="single"/>
-              <w:bottom w:color="c4c7c5" w:space="0" w:sz="5" w:val="single"/>
-              <w:right w:color="c4c7c5" w:space="0" w:sz="5" w:val="single"/>
+              <w:top w:color="000000" w:space="0" w:sz="8" w:val="single"/>
+              <w:left w:color="000000" w:space="0" w:sz="8" w:val="single"/>
+              <w:bottom w:color="000000" w:space="0" w:sz="8" w:val="single"/>
+              <w:right w:color="000000" w:space="0" w:sz="8" w:val="single"/>
             </w:tcBorders>
+            <w:shd w:fill="auto" w:val="clear"/>
             <w:tcMar>
-              <w:top w:w="120.0" w:type="dxa"/>
+              <w:top w:w="100.0" w:type="dxa"/>
               <w:left w:w="180.0" w:type="dxa"/>
-              <w:bottom w:w="120.0" w:type="dxa"/>
+              <w:bottom w:w="100.0" w:type="dxa"/>
               <w:right w:w="180.0" w:type="dxa"/>
             </w:tcMar>
             <w:vAlign w:val="top"/>
           </w:tcPr>
           <w:p>
             <w:pPr>
-              <w:spacing w:after="480" w:before="0" w:line="276" w:lineRule="auto"/>
+              <w:spacing w:line="360" w:lineRule="auto"/>
               <w:jc w:val="left"/>
               <w:rPr/>
             </w:pPr>
@@ -6659,156 +6711,30 @@
               <w:rPr>
                 <w:rtl w:val="0"/>
               </w:rPr>
-              <w:t xml:space="preserve">Màn hình dùng chung để hiển thị hiệu ứng lật mở giải thưởng, câu bình phẩm và tổng tiền trúng.</w:t>
+              <w:t xml:space="preserve">Khu vực cá nhân hiển thị thông tin tài khoản, cho phép thực hiện đổi mật khẩu và liên kết sang trang lịch sử.</w:t>
             </w:r>
           </w:p>
         </w:tc>
         <w:tc>
           <w:tcPr>
             <w:tcBorders>
-              <w:top w:color="c4c7c5" w:space="0" w:sz="5" w:val="single"/>
-              <w:left w:color="c4c7c5" w:space="0" w:sz="5" w:val="single"/>
-              <w:bottom w:color="c4c7c5" w:space="0" w:sz="5" w:val="single"/>
-              <w:right w:color="c4c7c5" w:space="0" w:sz="5" w:val="single"/>
+              <w:top w:color="000000" w:space="0" w:sz="8" w:val="single"/>
+              <w:left w:color="000000" w:space="0" w:sz="8" w:val="single"/>
+              <w:bottom w:color="000000" w:space="0" w:sz="8" w:val="single"/>
+              <w:right w:color="000000" w:space="0" w:sz="8" w:val="single"/>
             </w:tcBorders>
+            <w:shd w:fill="auto" w:val="clear"/>
             <w:tcMar>
-              <w:top w:w="120.0" w:type="dxa"/>
+              <w:top w:w="100.0" w:type="dxa"/>
               <w:left w:w="180.0" w:type="dxa"/>
-              <w:bottom w:w="120.0" w:type="dxa"/>
+              <w:bottom w:w="100.0" w:type="dxa"/>
               <w:right w:w="180.0" w:type="dxa"/>
             </w:tcMar>
             <w:vAlign w:val="top"/>
           </w:tcPr>
           <w:p>
             <w:pPr>
-              <w:spacing w:after="480" w:before="0" w:line="276" w:lineRule="auto"/>
-              <w:jc w:val="left"/>
-              <w:rPr/>
-            </w:pPr>
-            <w:r>
-              <w:rPr>
-                <w:rtl w:val="0"/>
-              </w:rPr>
-              <w:t xml:space="preserve">Cảm hứng Gamification</w:t>
-            </w:r>
-          </w:p>
-        </w:tc>
-      </w:tr>
-      <w:tr>
-        <w:trPr>
-          <w:cantSplit w:val="0"/>
-          <w:trHeight w:val="1365" w:hRule="atLeast"/>
-          <w:tblHeader w:val="0"/>
-        </w:trPr>
-        <w:tc>
-          <w:tcPr>
-            <w:tcBorders>
-              <w:top w:color="c4c7c5" w:space="0" w:sz="5" w:val="single"/>
-              <w:left w:color="c4c7c5" w:space="0" w:sz="5" w:val="single"/>
-              <w:bottom w:color="c4c7c5" w:space="0" w:sz="5" w:val="single"/>
-              <w:right w:color="c4c7c5" w:space="0" w:sz="5" w:val="single"/>
-            </w:tcBorders>
-            <w:tcMar>
-              <w:top w:w="120.0" w:type="dxa"/>
-              <w:left w:w="180.0" w:type="dxa"/>
-              <w:bottom w:w="120.0" w:type="dxa"/>
-              <w:right w:w="180.0" w:type="dxa"/>
-            </w:tcMar>
-            <w:vAlign w:val="top"/>
-          </w:tcPr>
-          <w:p>
-            <w:pPr>
-              <w:spacing w:after="480" w:before="0" w:line="276" w:lineRule="auto"/>
-              <w:jc w:val="left"/>
-              <w:rPr/>
-            </w:pPr>
-            <w:r>
-              <w:rPr>
-                <w:rtl w:val="0"/>
-              </w:rPr>
-              <w:t xml:space="preserve">7</w:t>
-            </w:r>
-          </w:p>
-        </w:tc>
-        <w:tc>
-          <w:tcPr>
-            <w:tcBorders>
-              <w:top w:color="c4c7c5" w:space="0" w:sz="5" w:val="single"/>
-              <w:left w:color="c4c7c5" w:space="0" w:sz="5" w:val="single"/>
-              <w:bottom w:color="c4c7c5" w:space="0" w:sz="5" w:val="single"/>
-              <w:right w:color="c4c7c5" w:space="0" w:sz="5" w:val="single"/>
-            </w:tcBorders>
-            <w:tcMar>
-              <w:top w:w="120.0" w:type="dxa"/>
-              <w:left w:w="180.0" w:type="dxa"/>
-              <w:bottom w:w="120.0" w:type="dxa"/>
-              <w:right w:w="180.0" w:type="dxa"/>
-            </w:tcMar>
-            <w:vAlign w:val="top"/>
-          </w:tcPr>
-          <w:p>
-            <w:pPr>
-              <w:spacing w:after="480" w:before="0" w:line="276" w:lineRule="auto"/>
-              <w:jc w:val="left"/>
-              <w:rPr/>
-            </w:pPr>
-            <w:r>
-              <w:rPr>
-                <w:rtl w:val="0"/>
-              </w:rPr>
-              <w:t xml:space="preserve">Màn hình quản lý tài khoản</w:t>
-            </w:r>
-          </w:p>
-        </w:tc>
-        <w:tc>
-          <w:tcPr>
-            <w:tcBorders>
-              <w:top w:color="c4c7c5" w:space="0" w:sz="5" w:val="single"/>
-              <w:left w:color="c4c7c5" w:space="0" w:sz="5" w:val="single"/>
-              <w:bottom w:color="c4c7c5" w:space="0" w:sz="5" w:val="single"/>
-              <w:right w:color="c4c7c5" w:space="0" w:sz="5" w:val="single"/>
-            </w:tcBorders>
-            <w:tcMar>
-              <w:top w:w="120.0" w:type="dxa"/>
-              <w:left w:w="180.0" w:type="dxa"/>
-              <w:bottom w:w="120.0" w:type="dxa"/>
-              <w:right w:w="180.0" w:type="dxa"/>
-            </w:tcMar>
-            <w:vAlign w:val="top"/>
-          </w:tcPr>
-          <w:p>
-            <w:pPr>
-              <w:spacing w:after="480" w:before="0" w:line="276" w:lineRule="auto"/>
-              <w:jc w:val="left"/>
-              <w:rPr/>
-            </w:pPr>
-            <w:r>
-              <w:rPr>
-                <w:rtl w:val="0"/>
-              </w:rPr>
-              <w:t xml:space="preserve">Khu vực cá nhân hóa chứa thông tin hồ sơ, lịch sử, thống kê và cấu hình bảo mật.</w:t>
-            </w:r>
-          </w:p>
-        </w:tc>
-        <w:tc>
-          <w:tcPr>
-            <w:tcBorders>
-              <w:top w:color="c4c7c5" w:space="0" w:sz="5" w:val="single"/>
-              <w:left w:color="c4c7c5" w:space="0" w:sz="5" w:val="single"/>
-              <w:bottom w:color="c4c7c5" w:space="0" w:sz="5" w:val="single"/>
-              <w:right w:color="c4c7c5" w:space="0" w:sz="5" w:val="single"/>
-            </w:tcBorders>
-            <w:tcMar>
-              <w:top w:w="120.0" w:type="dxa"/>
-              <w:left w:w="180.0" w:type="dxa"/>
-              <w:bottom w:w="120.0" w:type="dxa"/>
-              <w:right w:w="180.0" w:type="dxa"/>
-            </w:tcMar>
-            <w:vAlign w:val="top"/>
-          </w:tcPr>
-          <w:p>
-            <w:pPr>
-              <w:spacing w:after="480" w:before="0" w:line="276" w:lineRule="auto"/>
+              <w:spacing w:line="360" w:lineRule="auto"/>
               <w:jc w:val="left"/>
               <w:rPr/>
             </w:pPr>
@@ -6824,28 +6750,165 @@
       <w:tr>
         <w:trPr>
           <w:cantSplit w:val="0"/>
-          <w:trHeight w:val="1365" w:hRule="atLeast"/>
+          <w:trHeight w:val="1440" w:hRule="atLeast"/>
           <w:tblHeader w:val="0"/>
         </w:trPr>
         <w:tc>
           <w:tcPr>
             <w:tcBorders>
-              <w:top w:color="c4c7c5" w:space="0" w:sz="5" w:val="single"/>
-              <w:left w:color="c4c7c5" w:space="0" w:sz="5" w:val="single"/>
-              <w:bottom w:color="c4c7c5" w:space="0" w:sz="5" w:val="single"/>
-              <w:right w:color="c4c7c5" w:space="0" w:sz="5" w:val="single"/>
+              <w:top w:color="000000" w:space="0" w:sz="8" w:val="single"/>
+              <w:left w:color="000000" w:space="0" w:sz="8" w:val="single"/>
+              <w:bottom w:color="000000" w:space="0" w:sz="8" w:val="single"/>
+              <w:right w:color="000000" w:space="0" w:sz="8" w:val="single"/>
             </w:tcBorders>
+            <w:shd w:fill="auto" w:val="clear"/>
             <w:tcMar>
-              <w:top w:w="120.0" w:type="dxa"/>
+              <w:top w:w="100.0" w:type="dxa"/>
               <w:left w:w="180.0" w:type="dxa"/>
-              <w:bottom w:w="120.0" w:type="dxa"/>
+              <w:bottom w:w="100.0" w:type="dxa"/>
               <w:right w:w="180.0" w:type="dxa"/>
             </w:tcMar>
             <w:vAlign w:val="top"/>
           </w:tcPr>
           <w:p>
             <w:pPr>
-              <w:spacing w:after="480" w:before="0" w:line="276" w:lineRule="auto"/>
+              <w:spacing w:line="360" w:lineRule="auto"/>
+              <w:jc w:val="left"/>
+              <w:rPr/>
+            </w:pPr>
+            <w:r>
+              <w:rPr>
+                <w:rtl w:val="0"/>
+              </w:rPr>
+              <w:t xml:space="preserve">7</w:t>
+            </w:r>
+          </w:p>
+        </w:tc>
+        <w:tc>
+          <w:tcPr>
+            <w:tcBorders>
+              <w:top w:color="000000" w:space="0" w:sz="8" w:val="single"/>
+              <w:left w:color="000000" w:space="0" w:sz="8" w:val="single"/>
+              <w:bottom w:color="000000" w:space="0" w:sz="8" w:val="single"/>
+              <w:right w:color="000000" w:space="0" w:sz="8" w:val="single"/>
+            </w:tcBorders>
+            <w:shd w:fill="auto" w:val="clear"/>
+            <w:tcMar>
+              <w:top w:w="100.0" w:type="dxa"/>
+              <w:left w:w="180.0" w:type="dxa"/>
+              <w:bottom w:w="100.0" w:type="dxa"/>
+              <w:right w:w="180.0" w:type="dxa"/>
+            </w:tcMar>
+            <w:vAlign w:val="top"/>
+          </w:tcPr>
+          <w:p>
+            <w:pPr>
+              <w:spacing w:line="360" w:lineRule="auto"/>
+              <w:jc w:val="left"/>
+              <w:rPr/>
+            </w:pPr>
+            <w:r>
+              <w:rPr>
+                <w:rtl w:val="0"/>
+              </w:rPr>
+              <w:t xml:space="preserve">Màn hình Lịch sử, thống kê</w:t>
+            </w:r>
+          </w:p>
+        </w:tc>
+        <w:tc>
+          <w:tcPr>
+            <w:tcBorders>
+              <w:top w:color="000000" w:space="0" w:sz="8" w:val="single"/>
+              <w:left w:color="000000" w:space="0" w:sz="8" w:val="single"/>
+              <w:bottom w:color="000000" w:space="0" w:sz="8" w:val="single"/>
+              <w:right w:color="000000" w:space="0" w:sz="8" w:val="single"/>
+            </w:tcBorders>
+            <w:shd w:fill="auto" w:val="clear"/>
+            <w:tcMar>
+              <w:top w:w="100.0" w:type="dxa"/>
+              <w:left w:w="180.0" w:type="dxa"/>
+              <w:bottom w:w="100.0" w:type="dxa"/>
+              <w:right w:w="180.0" w:type="dxa"/>
+            </w:tcMar>
+            <w:vAlign w:val="top"/>
+          </w:tcPr>
+          <w:p>
+            <w:pPr>
+              <w:spacing w:line="360" w:lineRule="auto"/>
+              <w:jc w:val="left"/>
+              <w:rPr/>
+            </w:pPr>
+            <w:r>
+              <w:rPr>
+                <w:rtl w:val="0"/>
+              </w:rPr>
+              <w:t xml:space="preserve">Hiển thị danh sách các lần dò vé cũ và biểu đồ phân tích trực quan số tiền đã chi tiêu so với số tiền đã trúng giải.</w:t>
+            </w:r>
+          </w:p>
+        </w:tc>
+        <w:tc>
+          <w:tcPr>
+            <w:tcBorders>
+              <w:top w:color="000000" w:space="0" w:sz="8" w:val="single"/>
+              <w:left w:color="000000" w:space="0" w:sz="8" w:val="single"/>
+              <w:bottom w:color="000000" w:space="0" w:sz="8" w:val="single"/>
+              <w:right w:color="000000" w:space="0" w:sz="8" w:val="single"/>
+            </w:tcBorders>
+            <w:shd w:fill="auto" w:val="clear"/>
+            <w:tcMar>
+              <w:top w:w="100.0" w:type="dxa"/>
+              <w:left w:w="180.0" w:type="dxa"/>
+              <w:bottom w:w="100.0" w:type="dxa"/>
+              <w:right w:w="180.0" w:type="dxa"/>
+            </w:tcMar>
+            <w:vAlign w:val="top"/>
+          </w:tcPr>
+          <w:p>
+            <w:pPr>
+              <w:spacing w:line="360" w:lineRule="auto"/>
+              <w:jc w:val="left"/>
+              <w:rPr/>
+            </w:pPr>
+            <w:r>
+              <w:rPr>
+                <w:rtl w:val="0"/>
+              </w:rPr>
+              <w:t xml:space="preserve">minhngoc.net.vn</w:t>
+            </w:r>
+            <w:r>
+              <w:rPr>
+                <w:rtl w:val="0"/>
+              </w:rPr>
+            </w:r>
+          </w:p>
+        </w:tc>
+      </w:tr>
+      <w:tr>
+        <w:trPr>
+          <w:cantSplit w:val="0"/>
+          <w:trHeight w:val="1440" w:hRule="atLeast"/>
+          <w:tblHeader w:val="0"/>
+        </w:trPr>
+        <w:tc>
+          <w:tcPr>
+            <w:tcBorders>
+              <w:top w:color="000000" w:space="0" w:sz="8" w:val="single"/>
+              <w:left w:color="000000" w:space="0" w:sz="8" w:val="single"/>
+              <w:bottom w:color="000000" w:space="0" w:sz="8" w:val="single"/>
+              <w:right w:color="000000" w:space="0" w:sz="8" w:val="single"/>
+            </w:tcBorders>
+            <w:shd w:fill="auto" w:val="clear"/>
+            <w:tcMar>
+              <w:top w:w="100.0" w:type="dxa"/>
+              <w:left w:w="180.0" w:type="dxa"/>
+              <w:bottom w:w="100.0" w:type="dxa"/>
+              <w:right w:w="180.0" w:type="dxa"/>
+            </w:tcMar>
+            <w:vAlign w:val="top"/>
+          </w:tcPr>
+          <w:p>
+            <w:pPr>
+              <w:spacing w:line="360" w:lineRule="auto"/>
               <w:jc w:val="left"/>
               <w:rPr/>
             </w:pPr>
@@ -6860,22 +6923,23 @@
         <w:tc>
           <w:tcPr>
             <w:tcBorders>
-              <w:top w:color="c4c7c5" w:space="0" w:sz="5" w:val="single"/>
-              <w:left w:color="c4c7c5" w:space="0" w:sz="5" w:val="single"/>
-              <w:bottom w:color="c4c7c5" w:space="0" w:sz="5" w:val="single"/>
-              <w:right w:color="c4c7c5" w:space="0" w:sz="5" w:val="single"/>
+              <w:top w:color="000000" w:space="0" w:sz="8" w:val="single"/>
+              <w:left w:color="000000" w:space="0" w:sz="8" w:val="single"/>
+              <w:bottom w:color="000000" w:space="0" w:sz="8" w:val="single"/>
+              <w:right w:color="000000" w:space="0" w:sz="8" w:val="single"/>
             </w:tcBorders>
+            <w:shd w:fill="auto" w:val="clear"/>
             <w:tcMar>
-              <w:top w:w="120.0" w:type="dxa"/>
+              <w:top w:w="100.0" w:type="dxa"/>
               <w:left w:w="180.0" w:type="dxa"/>
-              <w:bottom w:w="120.0" w:type="dxa"/>
+              <w:bottom w:w="100.0" w:type="dxa"/>
               <w:right w:w="180.0" w:type="dxa"/>
             </w:tcMar>
             <w:vAlign w:val="top"/>
           </w:tcPr>
           <w:p>
             <w:pPr>
-              <w:spacing w:after="480" w:before="0" w:line="276" w:lineRule="auto"/>
+              <w:spacing w:line="360" w:lineRule="auto"/>
               <w:jc w:val="left"/>
               <w:rPr/>
             </w:pPr>
@@ -6883,29 +6947,30 @@
               <w:rPr>
                 <w:rtl w:val="0"/>
               </w:rPr>
-              <w:t xml:space="preserve">Lịch sử / Thống kê</w:t>
+              <w:t xml:space="preserve">Màn hình Quản Lý Người Dùng</w:t>
             </w:r>
           </w:p>
         </w:tc>
         <w:tc>
           <w:tcPr>
             <w:tcBorders>
-              <w:top w:color="c4c7c5" w:space="0" w:sz="5" w:val="single"/>
-              <w:left w:color="c4c7c5" w:space="0" w:sz="5" w:val="single"/>
-              <w:bottom w:color="c4c7c5" w:space="0" w:sz="5" w:val="single"/>
-              <w:right w:color="c4c7c5" w:space="0" w:sz="5" w:val="single"/>
+              <w:top w:color="000000" w:space="0" w:sz="8" w:val="single"/>
+              <w:left w:color="000000" w:space="0" w:sz="8" w:val="single"/>
+              <w:bottom w:color="000000" w:space="0" w:sz="8" w:val="single"/>
+              <w:right w:color="000000" w:space="0" w:sz="8" w:val="single"/>
             </w:tcBorders>
+            <w:shd w:fill="auto" w:val="clear"/>
             <w:tcMar>
-              <w:top w:w="120.0" w:type="dxa"/>
+              <w:top w:w="100.0" w:type="dxa"/>
               <w:left w:w="180.0" w:type="dxa"/>
-              <w:bottom w:w="120.0" w:type="dxa"/>
+              <w:bottom w:w="100.0" w:type="dxa"/>
               <w:right w:w="180.0" w:type="dxa"/>
             </w:tcMar>
             <w:vAlign w:val="top"/>
           </w:tcPr>
           <w:p>
             <w:pPr>
-              <w:spacing w:after="480" w:before="0" w:line="276" w:lineRule="auto"/>
+              <w:spacing w:line="360" w:lineRule="auto"/>
               <w:jc w:val="left"/>
               <w:rPr/>
             </w:pPr>
@@ -6913,156 +6978,30 @@
               <w:rPr>
                 <w:rtl w:val="0"/>
               </w:rPr>
-              <w:t xml:space="preserve">Hiển thị bảng tra cứu cũ và biểu đồ Recharts phân tích chi tiêu/trúng thưởng.</w:t>
+              <w:t xml:space="preserve">Giao diện Dashboard quản trị dành riêng cho ADMIN. Hiển thị bảng danh sách người dùng có phân trang (&gt;20 dòng) và bộ lọc tìm kiếm.</w:t>
             </w:r>
           </w:p>
         </w:tc>
         <w:tc>
           <w:tcPr>
             <w:tcBorders>
-              <w:top w:color="c4c7c5" w:space="0" w:sz="5" w:val="single"/>
-              <w:left w:color="c4c7c5" w:space="0" w:sz="5" w:val="single"/>
-              <w:bottom w:color="c4c7c5" w:space="0" w:sz="5" w:val="single"/>
-              <w:right w:color="c4c7c5" w:space="0" w:sz="5" w:val="single"/>
+              <w:top w:color="000000" w:space="0" w:sz="8" w:val="single"/>
+              <w:left w:color="000000" w:space="0" w:sz="8" w:val="single"/>
+              <w:bottom w:color="000000" w:space="0" w:sz="8" w:val="single"/>
+              <w:right w:color="000000" w:space="0" w:sz="8" w:val="single"/>
             </w:tcBorders>
+            <w:shd w:fill="auto" w:val="clear"/>
             <w:tcMar>
-              <w:top w:w="120.0" w:type="dxa"/>
+              <w:top w:w="100.0" w:type="dxa"/>
               <w:left w:w="180.0" w:type="dxa"/>
-              <w:bottom w:w="120.0" w:type="dxa"/>
+              <w:bottom w:w="100.0" w:type="dxa"/>
               <w:right w:w="180.0" w:type="dxa"/>
             </w:tcMar>
             <w:vAlign w:val="top"/>
           </w:tcPr>
           <w:p>
             <w:pPr>
-              <w:spacing w:after="480" w:before="0" w:line="276" w:lineRule="auto"/>
-              <w:jc w:val="left"/>
-              <w:rPr/>
-            </w:pPr>
-            <w:r>
-              <w:rPr>
-                <w:rtl w:val="0"/>
-              </w:rPr>
-              <w:t xml:space="preserve">minhngoc.net.vn</w:t>
-            </w:r>
-          </w:p>
-        </w:tc>
-      </w:tr>
-      <w:tr>
-        <w:trPr>
-          <w:cantSplit w:val="0"/>
-          <w:trHeight w:val="1365" w:hRule="atLeast"/>
-          <w:tblHeader w:val="0"/>
-        </w:trPr>
-        <w:tc>
-          <w:tcPr>
-            <w:tcBorders>
-              <w:top w:color="c4c7c5" w:space="0" w:sz="5" w:val="single"/>
-              <w:left w:color="c4c7c5" w:space="0" w:sz="5" w:val="single"/>
-              <w:bottom w:color="c4c7c5" w:space="0" w:sz="5" w:val="single"/>
-              <w:right w:color="c4c7c5" w:space="0" w:sz="5" w:val="single"/>
-            </w:tcBorders>
-            <w:tcMar>
-              <w:top w:w="120.0" w:type="dxa"/>
-              <w:left w:w="180.0" w:type="dxa"/>
-              <w:bottom w:w="120.0" w:type="dxa"/>
-              <w:right w:w="180.0" w:type="dxa"/>
-            </w:tcMar>
-            <w:vAlign w:val="top"/>
-          </w:tcPr>
-          <w:p>
-            <w:pPr>
-              <w:spacing w:after="480" w:before="0" w:line="276" w:lineRule="auto"/>
-              <w:jc w:val="left"/>
-              <w:rPr/>
-            </w:pPr>
-            <w:r>
-              <w:rPr>
-                <w:rtl w:val="0"/>
-              </w:rPr>
-              <w:t xml:space="preserve">9</w:t>
-            </w:r>
-          </w:p>
-        </w:tc>
-        <w:tc>
-          <w:tcPr>
-            <w:tcBorders>
-              <w:top w:color="c4c7c5" w:space="0" w:sz="5" w:val="single"/>
-              <w:left w:color="c4c7c5" w:space="0" w:sz="5" w:val="single"/>
-              <w:bottom w:color="c4c7c5" w:space="0" w:sz="5" w:val="single"/>
-              <w:right w:color="c4c7c5" w:space="0" w:sz="5" w:val="single"/>
-            </w:tcBorders>
-            <w:tcMar>
-              <w:top w:w="120.0" w:type="dxa"/>
-              <w:left w:w="180.0" w:type="dxa"/>
-              <w:bottom w:w="120.0" w:type="dxa"/>
-              <w:right w:w="180.0" w:type="dxa"/>
-            </w:tcMar>
-            <w:vAlign w:val="top"/>
-          </w:tcPr>
-          <w:p>
-            <w:pPr>
-              <w:spacing w:after="480" w:before="0" w:line="276" w:lineRule="auto"/>
-              <w:jc w:val="left"/>
-              <w:rPr/>
-            </w:pPr>
-            <w:r>
-              <w:rPr>
-                <w:rtl w:val="0"/>
-              </w:rPr>
-              <w:t xml:space="preserve">Màn hình Quản trị (Admin)</w:t>
-            </w:r>
-          </w:p>
-        </w:tc>
-        <w:tc>
-          <w:tcPr>
-            <w:tcBorders>
-              <w:top w:color="c4c7c5" w:space="0" w:sz="5" w:val="single"/>
-              <w:left w:color="c4c7c5" w:space="0" w:sz="5" w:val="single"/>
-              <w:bottom w:color="c4c7c5" w:space="0" w:sz="5" w:val="single"/>
-              <w:right w:color="c4c7c5" w:space="0" w:sz="5" w:val="single"/>
-            </w:tcBorders>
-            <w:tcMar>
-              <w:top w:w="120.0" w:type="dxa"/>
-              <w:left w:w="180.0" w:type="dxa"/>
-              <w:bottom w:w="120.0" w:type="dxa"/>
-              <w:right w:w="180.0" w:type="dxa"/>
-            </w:tcMar>
-            <w:vAlign w:val="top"/>
-          </w:tcPr>
-          <w:p>
-            <w:pPr>
-              <w:spacing w:after="480" w:before="0" w:line="276" w:lineRule="auto"/>
-              <w:jc w:val="left"/>
-              <w:rPr/>
-            </w:pPr>
-            <w:r>
-              <w:rPr>
-                <w:rtl w:val="0"/>
-              </w:rPr>
-              <w:t xml:space="preserve">Khu vực bảo mật (Dashboard) dành riêng cho người quản trị hệ thống.</w:t>
-            </w:r>
-          </w:p>
-        </w:tc>
-        <w:tc>
-          <w:tcPr>
-            <w:tcBorders>
-              <w:top w:color="c4c7c5" w:space="0" w:sz="5" w:val="single"/>
-              <w:left w:color="c4c7c5" w:space="0" w:sz="5" w:val="single"/>
-              <w:bottom w:color="c4c7c5" w:space="0" w:sz="5" w:val="single"/>
-              <w:right w:color="c4c7c5" w:space="0" w:sz="5" w:val="single"/>
-            </w:tcBorders>
-            <w:tcMar>
-              <w:top w:w="120.0" w:type="dxa"/>
-              <w:left w:w="180.0" w:type="dxa"/>
-              <w:bottom w:w="120.0" w:type="dxa"/>
-              <w:right w:w="180.0" w:type="dxa"/>
-            </w:tcMar>
-            <w:vAlign w:val="top"/>
-          </w:tcPr>
-          <w:p>
-            <w:pPr>
-              <w:spacing w:after="480" w:before="0" w:line="276" w:lineRule="auto"/>
+              <w:spacing w:line="360" w:lineRule="auto"/>
               <w:jc w:val="left"/>
               <w:rPr/>
             </w:pPr>
@@ -7078,28 +7017,29 @@
       <w:tr>
         <w:trPr>
           <w:cantSplit w:val="0"/>
-          <w:trHeight w:val="1365" w:hRule="atLeast"/>
+          <w:trHeight w:val="1755" w:hRule="atLeast"/>
           <w:tblHeader w:val="0"/>
         </w:trPr>
         <w:tc>
           <w:tcPr>
             <w:tcBorders>
-              <w:top w:color="c4c7c5" w:space="0" w:sz="5" w:val="single"/>
-              <w:left w:color="c4c7c5" w:space="0" w:sz="5" w:val="single"/>
-              <w:bottom w:color="c4c7c5" w:space="0" w:sz="5" w:val="single"/>
-              <w:right w:color="c4c7c5" w:space="0" w:sz="5" w:val="single"/>
+              <w:top w:color="000000" w:space="0" w:sz="8" w:val="single"/>
+              <w:left w:color="000000" w:space="0" w:sz="8" w:val="single"/>
+              <w:bottom w:color="000000" w:space="0" w:sz="8" w:val="single"/>
+              <w:right w:color="000000" w:space="0" w:sz="8" w:val="single"/>
             </w:tcBorders>
+            <w:shd w:fill="auto" w:val="clear"/>
             <w:tcMar>
-              <w:top w:w="120.0" w:type="dxa"/>
+              <w:top w:w="100.0" w:type="dxa"/>
               <w:left w:w="180.0" w:type="dxa"/>
-              <w:bottom w:w="120.0" w:type="dxa"/>
+              <w:bottom w:w="100.0" w:type="dxa"/>
               <w:right w:w="180.0" w:type="dxa"/>
             </w:tcMar>
             <w:vAlign w:val="top"/>
           </w:tcPr>
           <w:p>
             <w:pPr>
-              <w:spacing w:after="480" w:before="0" w:line="276" w:lineRule="auto"/>
+              <w:spacing w:line="360" w:lineRule="auto"/>
               <w:jc w:val="left"/>
               <w:rPr/>
             </w:pPr>
@@ -7107,29 +7047,30 @@
               <w:rPr>
                 <w:rtl w:val="0"/>
               </w:rPr>
-              <w:t xml:space="preserve">10</w:t>
+              <w:t xml:space="preserve">9</w:t>
             </w:r>
           </w:p>
         </w:tc>
         <w:tc>
           <w:tcPr>
             <w:tcBorders>
-              <w:top w:color="c4c7c5" w:space="0" w:sz="5" w:val="single"/>
-              <w:left w:color="c4c7c5" w:space="0" w:sz="5" w:val="single"/>
-              <w:bottom w:color="c4c7c5" w:space="0" w:sz="5" w:val="single"/>
-              <w:right w:color="c4c7c5" w:space="0" w:sz="5" w:val="single"/>
+              <w:top w:color="000000" w:space="0" w:sz="8" w:val="single"/>
+              <w:left w:color="000000" w:space="0" w:sz="8" w:val="single"/>
+              <w:bottom w:color="000000" w:space="0" w:sz="8" w:val="single"/>
+              <w:right w:color="000000" w:space="0" w:sz="8" w:val="single"/>
             </w:tcBorders>
+            <w:shd w:fill="auto" w:val="clear"/>
             <w:tcMar>
-              <w:top w:w="120.0" w:type="dxa"/>
+              <w:top w:w="100.0" w:type="dxa"/>
               <w:left w:w="180.0" w:type="dxa"/>
-              <w:bottom w:w="120.0" w:type="dxa"/>
+              <w:bottom w:w="100.0" w:type="dxa"/>
               <w:right w:w="180.0" w:type="dxa"/>
             </w:tcMar>
             <w:vAlign w:val="top"/>
           </w:tcPr>
           <w:p>
             <w:pPr>
-              <w:spacing w:after="480" w:before="0" w:line="276" w:lineRule="auto"/>
+              <w:spacing w:line="360" w:lineRule="auto"/>
               <w:jc w:val="left"/>
               <w:rPr/>
             </w:pPr>
@@ -7137,29 +7078,30 @@
               <w:rPr>
                 <w:rtl w:val="0"/>
               </w:rPr>
-              <w:t xml:space="preserve">Quản lý người dùng</w:t>
+              <w:t xml:space="preserve">Form quản lý người dùng</w:t>
             </w:r>
           </w:p>
         </w:tc>
         <w:tc>
           <w:tcPr>
             <w:tcBorders>
-              <w:top w:color="c4c7c5" w:space="0" w:sz="5" w:val="single"/>
-              <w:left w:color="c4c7c5" w:space="0" w:sz="5" w:val="single"/>
-              <w:bottom w:color="c4c7c5" w:space="0" w:sz="5" w:val="single"/>
-              <w:right w:color="c4c7c5" w:space="0" w:sz="5" w:val="single"/>
+              <w:top w:color="000000" w:space="0" w:sz="8" w:val="single"/>
+              <w:left w:color="000000" w:space="0" w:sz="8" w:val="single"/>
+              <w:bottom w:color="000000" w:space="0" w:sz="8" w:val="single"/>
+              <w:right w:color="000000" w:space="0" w:sz="8" w:val="single"/>
             </w:tcBorders>
+            <w:shd w:fill="auto" w:val="clear"/>
             <w:tcMar>
-              <w:top w:w="120.0" w:type="dxa"/>
+              <w:top w:w="100.0" w:type="dxa"/>
               <w:left w:w="180.0" w:type="dxa"/>
-              <w:bottom w:w="120.0" w:type="dxa"/>
+              <w:bottom w:w="100.0" w:type="dxa"/>
               <w:right w:w="180.0" w:type="dxa"/>
             </w:tcMar>
             <w:vAlign w:val="top"/>
           </w:tcPr>
           <w:p>
             <w:pPr>
-              <w:spacing w:after="480" w:before="0" w:line="276" w:lineRule="auto"/>
+              <w:spacing w:line="360" w:lineRule="auto"/>
               <w:jc w:val="left"/>
               <w:rPr/>
             </w:pPr>
@@ -7167,29 +7109,30 @@
               <w:rPr>
                 <w:rtl w:val="0"/>
               </w:rPr>
-              <w:t xml:space="preserve">Hiển thị bảng User, tìm kiếm, khóa/mở khóa, xuất Excel và gửi Email.</w:t>
+              <w:t xml:space="preserve">Giao diện dạng Popup/Drawer hiển thị chi tiết thông tin một người dùng được chọn để ADMIN đổi trạng thái hoạt động (Khóa/Mở) hoặc đổi ROLE.</w:t>
             </w:r>
           </w:p>
         </w:tc>
         <w:tc>
           <w:tcPr>
             <w:tcBorders>
-              <w:top w:color="c4c7c5" w:space="0" w:sz="5" w:val="single"/>
-              <w:left w:color="c4c7c5" w:space="0" w:sz="5" w:val="single"/>
-              <w:bottom w:color="c4c7c5" w:space="0" w:sz="5" w:val="single"/>
-              <w:right w:color="c4c7c5" w:space="0" w:sz="5" w:val="single"/>
+              <w:top w:color="000000" w:space="0" w:sz="8" w:val="single"/>
+              <w:left w:color="000000" w:space="0" w:sz="8" w:val="single"/>
+              <w:bottom w:color="000000" w:space="0" w:sz="8" w:val="single"/>
+              <w:right w:color="000000" w:space="0" w:sz="8" w:val="single"/>
             </w:tcBorders>
+            <w:shd w:fill="auto" w:val="clear"/>
             <w:tcMar>
-              <w:top w:w="120.0" w:type="dxa"/>
+              <w:top w:w="100.0" w:type="dxa"/>
               <w:left w:w="180.0" w:type="dxa"/>
-              <w:bottom w:w="120.0" w:type="dxa"/>
+              <w:bottom w:w="100.0" w:type="dxa"/>
               <w:right w:w="180.0" w:type="dxa"/>
             </w:tcMar>
             <w:vAlign w:val="top"/>
           </w:tcPr>
           <w:p>
             <w:pPr>
-              <w:spacing w:after="480" w:before="0" w:line="276" w:lineRule="auto"/>
+              <w:spacing w:line="360" w:lineRule="auto"/>
               <w:jc w:val="left"/>
               <w:rPr/>
             </w:pPr>
@@ -7205,28 +7148,160 @@
       <w:tr>
         <w:trPr>
           <w:cantSplit w:val="0"/>
-          <w:trHeight w:val="1365" w:hRule="atLeast"/>
+          <w:trHeight w:val="1440" w:hRule="atLeast"/>
           <w:tblHeader w:val="0"/>
         </w:trPr>
         <w:tc>
           <w:tcPr>
             <w:tcBorders>
-              <w:top w:color="c4c7c5" w:space="0" w:sz="5" w:val="single"/>
-              <w:left w:color="c4c7c5" w:space="0" w:sz="5" w:val="single"/>
-              <w:bottom w:color="c4c7c5" w:space="0" w:sz="5" w:val="single"/>
-              <w:right w:color="c4c7c5" w:space="0" w:sz="5" w:val="single"/>
+              <w:top w:color="000000" w:space="0" w:sz="8" w:val="single"/>
+              <w:left w:color="000000" w:space="0" w:sz="8" w:val="single"/>
+              <w:bottom w:color="000000" w:space="0" w:sz="8" w:val="single"/>
+              <w:right w:color="000000" w:space="0" w:sz="8" w:val="single"/>
             </w:tcBorders>
+            <w:shd w:fill="auto" w:val="clear"/>
             <w:tcMar>
-              <w:top w:w="120.0" w:type="dxa"/>
+              <w:top w:w="100.0" w:type="dxa"/>
               <w:left w:w="180.0" w:type="dxa"/>
-              <w:bottom w:w="120.0" w:type="dxa"/>
+              <w:bottom w:w="100.0" w:type="dxa"/>
               <w:right w:w="180.0" w:type="dxa"/>
             </w:tcMar>
             <w:vAlign w:val="top"/>
           </w:tcPr>
           <w:p>
             <w:pPr>
-              <w:spacing w:after="480" w:before="0" w:line="276" w:lineRule="auto"/>
+              <w:spacing w:line="360" w:lineRule="auto"/>
+              <w:jc w:val="left"/>
+              <w:rPr/>
+            </w:pPr>
+            <w:r>
+              <w:rPr>
+                <w:rtl w:val="0"/>
+              </w:rPr>
+              <w:t xml:space="preserve">10</w:t>
+            </w:r>
+          </w:p>
+        </w:tc>
+        <w:tc>
+          <w:tcPr>
+            <w:tcBorders>
+              <w:top w:color="000000" w:space="0" w:sz="8" w:val="single"/>
+              <w:left w:color="000000" w:space="0" w:sz="8" w:val="single"/>
+              <w:bottom w:color="000000" w:space="0" w:sz="8" w:val="single"/>
+              <w:right w:color="000000" w:space="0" w:sz="8" w:val="single"/>
+            </w:tcBorders>
+            <w:shd w:fill="auto" w:val="clear"/>
+            <w:tcMar>
+              <w:top w:w="100.0" w:type="dxa"/>
+              <w:left w:w="180.0" w:type="dxa"/>
+              <w:bottom w:w="100.0" w:type="dxa"/>
+              <w:right w:w="180.0" w:type="dxa"/>
+            </w:tcMar>
+            <w:vAlign w:val="top"/>
+          </w:tcPr>
+          <w:p>
+            <w:pPr>
+              <w:spacing w:line="360" w:lineRule="auto"/>
+              <w:jc w:val="left"/>
+              <w:rPr/>
+            </w:pPr>
+            <w:r>
+              <w:rPr>
+                <w:rtl w:val="0"/>
+              </w:rPr>
+              <w:t xml:space="preserve">Màn hình Quản Lý Kết Quả Xổ Số</w:t>
+            </w:r>
+          </w:p>
+        </w:tc>
+        <w:tc>
+          <w:tcPr>
+            <w:tcBorders>
+              <w:top w:color="000000" w:space="0" w:sz="8" w:val="single"/>
+              <w:left w:color="000000" w:space="0" w:sz="8" w:val="single"/>
+              <w:bottom w:color="000000" w:space="0" w:sz="8" w:val="single"/>
+              <w:right w:color="000000" w:space="0" w:sz="8" w:val="single"/>
+            </w:tcBorders>
+            <w:shd w:fill="auto" w:val="clear"/>
+            <w:tcMar>
+              <w:top w:w="100.0" w:type="dxa"/>
+              <w:left w:w="180.0" w:type="dxa"/>
+              <w:bottom w:w="100.0" w:type="dxa"/>
+              <w:right w:w="180.0" w:type="dxa"/>
+            </w:tcMar>
+            <w:vAlign w:val="top"/>
+          </w:tcPr>
+          <w:p>
+            <w:pPr>
+              <w:spacing w:line="360" w:lineRule="auto"/>
+              <w:jc w:val="left"/>
+              <w:rPr/>
+            </w:pPr>
+            <w:r>
+              <w:rPr>
+                <w:rtl w:val="0"/>
+              </w:rPr>
+              <w:t xml:space="preserve">Giao diện quản lý các kỳ quay số (Vé dò) của ADMIN, có thống kê lượt tra cứu và phân trang (&gt;10 dòng).</w:t>
+            </w:r>
+          </w:p>
+        </w:tc>
+        <w:tc>
+          <w:tcPr>
+            <w:tcBorders>
+              <w:top w:color="000000" w:space="0" w:sz="8" w:val="single"/>
+              <w:left w:color="000000" w:space="0" w:sz="8" w:val="single"/>
+              <w:bottom w:color="000000" w:space="0" w:sz="8" w:val="single"/>
+              <w:right w:color="000000" w:space="0" w:sz="8" w:val="single"/>
+            </w:tcBorders>
+            <w:shd w:fill="auto" w:val="clear"/>
+            <w:tcMar>
+              <w:top w:w="100.0" w:type="dxa"/>
+              <w:left w:w="180.0" w:type="dxa"/>
+              <w:bottom w:w="100.0" w:type="dxa"/>
+              <w:right w:w="180.0" w:type="dxa"/>
+            </w:tcMar>
+            <w:vAlign w:val="top"/>
+          </w:tcPr>
+          <w:p>
+            <w:pPr>
+              <w:spacing w:line="360" w:lineRule="auto"/>
+              <w:jc w:val="left"/>
+              <w:rPr/>
+            </w:pPr>
+            <w:r>
+              <w:rPr>
+                <w:rtl w:val="0"/>
+              </w:rPr>
+              <w:t xml:space="preserve">AntD Admin Theme</w:t>
+            </w:r>
+          </w:p>
+        </w:tc>
+      </w:tr>
+      <w:tr>
+        <w:trPr>
+          <w:cantSplit w:val="0"/>
+          <w:trHeight w:val="1440" w:hRule="atLeast"/>
+          <w:tblHeader w:val="0"/>
+        </w:trPr>
+        <w:tc>
+          <w:tcPr>
+            <w:tcBorders>
+              <w:top w:color="000000" w:space="0" w:sz="8" w:val="single"/>
+              <w:left w:color="000000" w:space="0" w:sz="8" w:val="single"/>
+              <w:bottom w:color="000000" w:space="0" w:sz="8" w:val="single"/>
+              <w:right w:color="000000" w:space="0" w:sz="8" w:val="single"/>
+            </w:tcBorders>
+            <w:shd w:fill="auto" w:val="clear"/>
+            <w:tcMar>
+              <w:top w:w="100.0" w:type="dxa"/>
+              <w:left w:w="180.0" w:type="dxa"/>
+              <w:bottom w:w="100.0" w:type="dxa"/>
+              <w:right w:w="180.0" w:type="dxa"/>
+            </w:tcMar>
+            <w:vAlign w:val="top"/>
+          </w:tcPr>
+          <w:p>
+            <w:pPr>
+              <w:spacing w:line="360" w:lineRule="auto"/>
               <w:jc w:val="left"/>
               <w:rPr/>
             </w:pPr>
@@ -7241,22 +7316,23 @@
         <w:tc>
           <w:tcPr>
             <w:tcBorders>
-              <w:top w:color="c4c7c5" w:space="0" w:sz="5" w:val="single"/>
-              <w:left w:color="c4c7c5" w:space="0" w:sz="5" w:val="single"/>
-              <w:bottom w:color="c4c7c5" w:space="0" w:sz="5" w:val="single"/>
-              <w:right w:color="c4c7c5" w:space="0" w:sz="5" w:val="single"/>
+              <w:top w:color="000000" w:space="0" w:sz="8" w:val="single"/>
+              <w:left w:color="000000" w:space="0" w:sz="8" w:val="single"/>
+              <w:bottom w:color="000000" w:space="0" w:sz="8" w:val="single"/>
+              <w:right w:color="000000" w:space="0" w:sz="8" w:val="single"/>
             </w:tcBorders>
+            <w:shd w:fill="auto" w:val="clear"/>
             <w:tcMar>
-              <w:top w:w="120.0" w:type="dxa"/>
+              <w:top w:w="100.0" w:type="dxa"/>
               <w:left w:w="180.0" w:type="dxa"/>
-              <w:bottom w:w="120.0" w:type="dxa"/>
+              <w:bottom w:w="100.0" w:type="dxa"/>
               <w:right w:w="180.0" w:type="dxa"/>
             </w:tcMar>
             <w:vAlign w:val="top"/>
           </w:tcPr>
           <w:p>
             <w:pPr>
-              <w:spacing w:after="480" w:before="0" w:line="276" w:lineRule="auto"/>
+              <w:spacing w:line="360" w:lineRule="auto"/>
               <w:jc w:val="left"/>
               <w:rPr/>
             </w:pPr>
@@ -7264,29 +7340,30 @@
               <w:rPr>
                 <w:rtl w:val="0"/>
               </w:rPr>
-              <w:t xml:space="preserve">Quản lý kết quả / Thêm kết quả</w:t>
+              <w:t xml:space="preserve">Form Thông tin vé dò</w:t>
             </w:r>
           </w:p>
         </w:tc>
         <w:tc>
           <w:tcPr>
             <w:tcBorders>
-              <w:top w:color="c4c7c5" w:space="0" w:sz="5" w:val="single"/>
-              <w:left w:color="c4c7c5" w:space="0" w:sz="5" w:val="single"/>
-              <w:bottom w:color="c4c7c5" w:space="0" w:sz="5" w:val="single"/>
-              <w:right w:color="c4c7c5" w:space="0" w:sz="5" w:val="single"/>
+              <w:top w:color="000000" w:space="0" w:sz="8" w:val="single"/>
+              <w:left w:color="000000" w:space="0" w:sz="8" w:val="single"/>
+              <w:bottom w:color="000000" w:space="0" w:sz="8" w:val="single"/>
+              <w:right w:color="000000" w:space="0" w:sz="8" w:val="single"/>
             </w:tcBorders>
+            <w:shd w:fill="auto" w:val="clear"/>
             <w:tcMar>
-              <w:top w:w="120.0" w:type="dxa"/>
+              <w:top w:w="100.0" w:type="dxa"/>
               <w:left w:w="180.0" w:type="dxa"/>
-              <w:bottom w:w="120.0" w:type="dxa"/>
+              <w:bottom w:w="100.0" w:type="dxa"/>
               <w:right w:w="180.0" w:type="dxa"/>
             </w:tcMar>
             <w:vAlign w:val="top"/>
           </w:tcPr>
           <w:p>
             <w:pPr>
-              <w:spacing w:after="480" w:before="0" w:line="276" w:lineRule="auto"/>
+              <w:spacing w:line="360" w:lineRule="auto"/>
               <w:jc w:val="left"/>
               <w:rPr/>
             </w:pPr>
@@ -7294,29 +7371,30 @@
               <w:rPr>
                 <w:rtl w:val="0"/>
               </w:rPr>
-              <w:t xml:space="preserve">Danh sách các kết quả xổ số hiện có và Form để nhập liệu kết quả mới vào hệ thống.</w:t>
+              <w:t xml:space="preserve">Giao diện để ADMIN điền thông tin chi tiết các giải trúng thưởng của kỳ quay mới, hoặc chỉnh sửa thông tin cũ.</w:t>
             </w:r>
           </w:p>
         </w:tc>
         <w:tc>
           <w:tcPr>
             <w:tcBorders>
-              <w:top w:color="c4c7c5" w:space="0" w:sz="5" w:val="single"/>
-              <w:left w:color="c4c7c5" w:space="0" w:sz="5" w:val="single"/>
-              <w:bottom w:color="c4c7c5" w:space="0" w:sz="5" w:val="single"/>
-              <w:right w:color="c4c7c5" w:space="0" w:sz="5" w:val="single"/>
+              <w:top w:color="000000" w:space="0" w:sz="8" w:val="single"/>
+              <w:left w:color="000000" w:space="0" w:sz="8" w:val="single"/>
+              <w:bottom w:color="000000" w:space="0" w:sz="8" w:val="single"/>
+              <w:right w:color="000000" w:space="0" w:sz="8" w:val="single"/>
             </w:tcBorders>
+            <w:shd w:fill="auto" w:val="clear"/>
             <w:tcMar>
-              <w:top w:w="120.0" w:type="dxa"/>
+              <w:top w:w="100.0" w:type="dxa"/>
               <w:left w:w="180.0" w:type="dxa"/>
-              <w:bottom w:w="120.0" w:type="dxa"/>
+              <w:bottom w:w="100.0" w:type="dxa"/>
               <w:right w:w="180.0" w:type="dxa"/>
             </w:tcMar>
             <w:vAlign w:val="top"/>
           </w:tcPr>
           <w:p>
             <w:pPr>
-              <w:spacing w:after="480" w:before="0" w:line="276" w:lineRule="auto"/>
+              <w:spacing w:line="360" w:lineRule="auto"/>
               <w:jc w:val="left"/>
               <w:rPr/>
             </w:pPr>
@@ -7324,7 +7402,18 @@
               <w:rPr>
                 <w:rtl w:val="0"/>
               </w:rPr>
-              <w:t xml:space="preserve">Form nhập xskt.com.vn</w:t>
+              <w:t xml:space="preserve">Form nhập </w:t>
+            </w:r>
+            <w:r>
+              <w:rPr>
+                <w:rtl w:val="0"/>
+              </w:rPr>
+              <w:t xml:space="preserve">xskt.com.vn</w:t>
+            </w:r>
+            <w:r>
+              <w:rPr>
+                <w:rtl w:val="0"/>
+              </w:rPr>
             </w:r>
           </w:p>
         </w:tc>
@@ -10382,6 +10471,45 @@
       <w:tblStyleColBandSize w:val="1"/>
       <w:tblCellMar/>
     </w:tblPr>
+    <w:tcPr>
+      <w:shd w:fill="191919" w:val="clear"/>
+    </w:tcPr>
+    <w:tblStylePr w:type="band1Horz">
+      <w:tcPr/>
+    </w:tblStylePr>
+    <w:tblStylePr w:type="band1Vert">
+      <w:tcPr/>
+    </w:tblStylePr>
+    <w:tblStylePr w:type="band2Horz">
+      <w:tcPr/>
+    </w:tblStylePr>
+    <w:tblStylePr w:type="band2Vert">
+      <w:tcPr/>
+    </w:tblStylePr>
+    <w:tblStylePr w:type="firstCol">
+      <w:tcPr/>
+    </w:tblStylePr>
+    <w:tblStylePr w:type="firstRow">
+      <w:tcPr/>
+    </w:tblStylePr>
+    <w:tblStylePr w:type="lastCol">
+      <w:tcPr/>
+    </w:tblStylePr>
+    <w:tblStylePr w:type="lastRow">
+      <w:tcPr/>
+    </w:tblStylePr>
+    <w:tblStylePr w:type="neCell">
+      <w:tcPr/>
+    </w:tblStylePr>
+    <w:tblStylePr w:type="nwCell">
+      <w:tcPr/>
+    </w:tblStylePr>
+    <w:tblStylePr w:type="seCell">
+      <w:tcPr/>
+    </w:tblStylePr>
+    <w:tblStylePr w:type="swCell">
+      <w:tcPr/>
+    </w:tblStylePr>
   </w:style>
 </w:styles>
 </file>

</xml_diff>